<commit_message>
Chapter 1: running company renamed to Bahar in the text; distinct company names in end-of-chapter questions
Co-Authored-By: Claude Sonnet 5.5 <noreply@anthropic.com>
Claude-Session: https://claude.ai/code/session_01BKYmyGRjeasSCqf91ZP9Rq
</commit_message>
<xml_diff>
--- a/ch1_conceptual_framework_updated.docx
+++ b/ch1_conceptual_framework_updated.docx
@@ -294,7 +294,7 @@
           <w:szCs w:val="22"/>
           <w:rtl/>
         </w:rPr>
-        <w:t xml:space="preserve">ساعت از نیمه‌شب ۲۹ اسفند گذشته است و حسابدار شرکت «آرمان‌کشت»، تولیدکننده تراکتور و ماشین‌آلات کشاورزی، هنوز پشت میزش نشسته است. روز ۲۸ اسفند تراکتوری به بهای ۱۰ میلیارد ریال به مشتری اعتباری تحویل داده شده و مشتری قول داده بهای آن را ۱۵ فروردین بپردازد. حسابدار ارشد معتقد است درآمد این فروش مال امسال است. همکار جوان‌ترش می‌گوید: «تا پول نیامده، درآمدی نداریم.» هر دو با اطمینان سخن می‌گویند و هر دو می‌توانند از نظر خود دفاع کنند. اما نتیجه‌ی این اختلاف ساده نیست: اگر درآمد امسال ثبت شود، سود شرکت ده میلیارد ریال بیشتر می‌شود و پاداش مدیران، ارزیابی بانک و قیمت سهام، همه تغییر می‌کنند. پس چه کسی حق دارد میان این دو قضاوت کند؟ به قاعده‌ای مشترک نیاز داریم و آن قاعده، موضوع این فصل است. در سراسر فصل همین شرکت فرضی همراه ما خواهد بود.</w:t>
+        <w:t xml:space="preserve">ساعت از نیمه‌شب ۲۹ اسفند گذشته است و حسابدار شرکت بهار، تولیدکننده تراکتور و ماشین‌آلات کشاورزی، هنوز پشت میزش نشسته است. روز ۲۸ اسفند تراکتوری به بهای ۱۰ میلیارد ریال به مشتری اعتباری تحویل داده شده و مشتری قول داده بهای آن را ۱۵ فروردین بپردازد. حسابدار ارشد معتقد است درآمد این فروش مال امسال است. همکار جوان‌ترش می‌گوید: «تا پول نیامده، درآمدی نداریم.» هر دو با اطمینان سخن می‌گویند و هر دو می‌توانند از نظر خود دفاع کنند. اما نتیجه‌ی این اختلاف ساده نیست: اگر درآمد امسال ثبت شود، سود شرکت ده میلیارد ریال بیشتر می‌شود و پاداش مدیران، ارزیابی بانک و قیمت سهام، همه تغییر می‌کنند. پس چه کسی حق دارد میان این دو قضاوت کند؟ به قاعده‌ای مشترک نیاز داریم و آن قاعده، موضوع این فصل است. در سراسر فصل همین شرکت فرضی همراه ما خواهد بود.</w:t>
       </w:r>
     </w:p>
     <w:p>
@@ -1526,7 +1526,7 @@
           <w:szCs w:val="20"/>
           <w:rtl/>
         </w:rPr>
-        <w:t xml:space="preserve">ب-۱ پایان سال آرمان‌کشت</w:t>
+        <w:t xml:space="preserve">ب-۱ پایان سال شرکت بهار</w:t>
       </w:r>
     </w:p>
     <w:p>
@@ -6394,7 +6394,7 @@
           <w:szCs w:val="22"/>
           <w:rtl/>
         </w:rPr>
-        <w:t xml:space="preserve">سرانجام، منابع و ادعاها ممکن است به دلیلی غیر از عملکرد مالی نیز تغییر کند، مانند انتشار ابزارهای بدهی یا ابزارهای مالکانه. اطلاعات درباره این نوع تغییرات از آن جهت لازم است که درک کاملی از دلیل تغییر منابع و ادعاها و از آثار آن بر عملکرد مالی آتی واحد گزارشگر به استفاده‌کنندگان می‌دهد (چارچوب مفهومی، بند ۱.۲۱). در آرمان‌کشت، افزایش سرمایه‌ای که سهامداران به شرکت تزریق می‌کنند نمونه همین دسته است: دارایی شرکت بالا می‌رود، اما ربطی به عملکرد ندارد و اگر با سود مخلوط شود تصویر اشتباه می‌دهد.</w:t>
+        <w:t xml:space="preserve">سرانجام، منابع و ادعاها ممکن است به دلیلی غیر از عملکرد مالی نیز تغییر کند، مانند انتشار ابزارهای بدهی یا ابزارهای مالکانه. اطلاعات درباره این نوع تغییرات از آن جهت لازم است که درک کاملی از دلیل تغییر منابع و ادعاها و از آثار آن بر عملکرد مالی آتی واحد گزارشگر به استفاده‌کنندگان می‌دهد (چارچوب مفهومی، بند ۱.۲۱). در شرکت بهار، افزایش سرمایه‌ای که سهامداران به شرکت تزریق می‌کنند نمونه همین دسته است: دارایی شرکت بالا می‌رود، اما ربطی به عملکرد ندارد و اگر با سود مخلوط شود تصویر اشتباه می‌دهد.</w:t>
       </w:r>
     </w:p>
     <w:tbl>
@@ -6471,7 +6471,7 @@
                 <w:szCs w:val="20"/>
                 <w:rtl/>
               </w:rPr>
-              <w:t xml:space="preserve">به تراکتور آرمان‌کشت برگردیم. بر مبنای نقدی، امسال هیچ درآمدی ثبت نمی‌شود، که تصویر گمراه‌کننده‌ای است؛ زیرا شرکت کار خود را انجام داده و منبع اقتصادی تازه‌ای به نام مطالبات به دست آورده است. </w:t>
+              <w:t xml:space="preserve">به تراکتور شرکت بهار برگردیم. بر مبنای نقدی، امسال هیچ درآمدی ثبت نمی‌شود، که تصویر گمراه‌کننده‌ای است؛ زیرا شرکت کار خود را انجام داده و منبع اقتصادی تازه‌ای به نام مطالبات به دست آورده است. </w:t>
             </w:r>
             <w:r>
               <w:rPr>
@@ -6604,7 +6604,7 @@
           <w:szCs w:val="22"/>
           <w:rtl/>
         </w:rPr>
-        <w:t xml:space="preserve">این تعریف دو نکته دارد. نخست، تفکیک گزارشگری و تفکیک حقوقی دو چیز است: ممکن است بخشی از یک شرکت، مثلاً یک شعبه یا یک بخش تجاری، واحد گزارشگر باشد، و ممکن است چند شرکت جداگانه با هم یک واحد گزارشگر شوند. دوم، واحد گزارشگر یا الزام قانونی دارد یا خود انتخاب کرده است؛ شرکتی که قانون آن را ملزم به تهیه صورت‌های مالی نکرده است نیز می‌تواند داوطلبانه واحد گزارشگر شود. صورت‌های مالی هم اطلاعات مربوط به معاملات و سایر رویدادها را از دیدگاه واحد گزارشگر به‌عنوان یک مجموعه واحد ارائه می‌کند، نه از دیدگاه گروه خاصی از سرمایه‌گذاران، وام‌دهندگان یا سایر اعتباردهندگان فعلی یا بالقوه (چارچوب مفهومی، بند ۳.۸). پیامد این اصل ظریف است. وقتی آرمان‌کشت سهام جدید منتشر می‌کند، صورت‌های مالی ماجرا را از نگاه شرکت می‌بیند، نه از نگاه سهامدار قدیمی که سهمش رقیق شده است یا سهامدار تازه‌ای که سهم می‌خرد. نگاه شرکت میان استفاده‌کنندگان ناهمسو بی‌طرف است و همین بی‌طرفی صورت‌ها را برای هر سه گروه استفاده‌کننده قابل استفاده می‌کند.</w:t>
+        <w:t xml:space="preserve">این تعریف دو نکته دارد. نخست، تفکیک گزارشگری و تفکیک حقوقی دو چیز است: ممکن است بخشی از یک شرکت، مثلاً یک شعبه یا یک بخش تجاری، واحد گزارشگر باشد، و ممکن است چند شرکت جداگانه با هم یک واحد گزارشگر شوند. دوم، واحد گزارشگر یا الزام قانونی دارد یا خود انتخاب کرده است؛ شرکتی که قانون آن را ملزم به تهیه صورت‌های مالی نکرده است نیز می‌تواند داوطلبانه واحد گزارشگر شود. صورت‌های مالی هم اطلاعات مربوط به معاملات و سایر رویدادها را از دیدگاه واحد گزارشگر به‌عنوان یک مجموعه واحد ارائه می‌کند، نه از دیدگاه گروه خاصی از سرمایه‌گذاران، وام‌دهندگان یا سایر اعتباردهندگان فعلی یا بالقوه (چارچوب مفهومی، بند ۳.۸). پیامد این اصل ظریف است. وقتی شرکت بهار سهام جدید منتشر می‌کند، صورت‌های مالی ماجرا را از نگاه شرکت می‌بیند، نه از نگاه سهامدار قدیمی که سهمش رقیق شده است یا سهامدار تازه‌ای که سهم می‌خرد. نگاه شرکت میان استفاده‌کنندگان ناهمسو بی‌طرف است و همین بی‌طرفی صورت‌ها را برای هر سه گروه استفاده‌کننده قابل استفاده می‌کند.</w:t>
       </w:r>
     </w:p>
     <w:p>
@@ -6655,7 +6655,7 @@
           <w:szCs w:val="22"/>
           <w:rtl/>
         </w:rPr>
-        <w:t xml:space="preserve">صورت‌های مالی تلفیقی اطلاعاتی درباره دارایی‌ها، بدهی‌ها، حقوق مالکانه، درآمدها و هزینه‌های واحد تجاری اصلی و فرعی‌های آن را در قالب یک واحد گزارشگر منفرد ارائه می‌کند. این اطلاعات برای سرمایه‌گذاران، وام‌دهندگان و سایر اعتباردهندگان فعلی و بالقوه واحد تجاری اصلی، در ارزیابی انتظارات نسبت به خالص جریان‌های نقدی ورودی آتی به آن واحد مفید است. دلیل این است که خالص جریان‌های نقدی ورودی به واحد اصلی شامل توزیع منابع از فرعی‌ها به اصلی است و آن توزیع‌ها خود به خالص جریان‌های نقدی ورودی به فرعی‌ها بستگی دارد (چارچوب مفهومی، بند ۳.۱۵). به همین دلیل اگر آرمان‌کشت شرکت فرعی خدمات پس از فروش داشته باشد، سرمایه‌گذار آرمان‌کشت، که سود تقسیمی آتی را از خود آرمان‌کشت انتظار دارد، برای ارزیابی این سود باید بداند فرعی‌ها چه می‌کنند و صورت‌های مالی تلفیقی را بخواند. اما تلفیقی برای همه نیازها طراحی نشده است. این صورت‌ها برای ارائه اطلاعات جداگانه درباره دارایی‌ها، بدهی‌ها، حقوق مالکانه، درآمدها و هزینه‌های یک واحد فرعی خاص تهیه نمی‌شود؛ صورت‌های مالی خود آن واحد فرعی برای این منظور طراحی شده است (چارچوب مفهومی، بند ۳.۱۶). وام‌دهنده یک شرکت فرعی نباید اطلاعات تلفیقی گروه را معیار سنجش اعتبار آن فرعی بداند.</w:t>
+        <w:t xml:space="preserve">صورت‌های مالی تلفیقی اطلاعاتی درباره دارایی‌ها، بدهی‌ها، حقوق مالکانه، درآمدها و هزینه‌های واحد تجاری اصلی و فرعی‌های آن را در قالب یک واحد گزارشگر منفرد ارائه می‌کند. این اطلاعات برای سرمایه‌گذاران، وام‌دهندگان و سایر اعتباردهندگان فعلی و بالقوه واحد تجاری اصلی، در ارزیابی انتظارات نسبت به خالص جریان‌های نقدی ورودی آتی به آن واحد مفید است. دلیل این است که خالص جریان‌های نقدی ورودی به واحد اصلی شامل توزیع منابع از فرعی‌ها به اصلی است و آن توزیع‌ها خود به خالص جریان‌های نقدی ورودی به فرعی‌ها بستگی دارد (چارچوب مفهومی، بند ۳.۱۵). به همین دلیل اگر شرکت بهار شرکت فرعی خدمات پس از فروش داشته باشد، سرمایه‌گذار شرکت بهار، که سود تقسیمی آتی را از خود شرکت بهار انتظار دارد، برای ارزیابی این سود باید بداند فرعی‌ها چه می‌کنند و صورت‌های مالی تلفیقی را بخواند. اما تلفیقی برای همه نیازها طراحی نشده است. این صورت‌ها برای ارائه اطلاعات جداگانه درباره دارایی‌ها، بدهی‌ها، حقوق مالکانه، درآمدها و هزینه‌های یک واحد فرعی خاص تهیه نمی‌شود؛ صورت‌های مالی خود آن واحد فرعی برای این منظور طراحی شده است (چارچوب مفهومی، بند ۳.۱۶). وام‌دهنده یک شرکت فرعی نباید اطلاعات تلفیقی گروه را معیار سنجش اعتبار آن فرعی بداند.</w:t>
       </w:r>
     </w:p>
     <w:p>
@@ -8006,7 +8006,7 @@
                 <w:szCs w:val="20"/>
                 <w:rtl/>
               </w:rPr>
-              <w:t xml:space="preserve">خرید یک آچار ۵۰۰ هزار ریالی برای آرمان‌کشت بی‌اهمیت است و فوراً هزینه می‌شود، حتی اگر ده سال عمر کند؛ سرمایه‌ای کردن و استهلاک‌گیری آن هزینه‌ای بیش از ارزش اطلاعاتش دارد. اما فرض کنید شرکتی دیگر سه سال متوالی زیان‌ده بوده و امسال با کاهش ناچیز ذخیره مطالبات مشکوک‌الوصول، که فقط ۳ درصد سود را تغییر می‌دهد، «سودده» دیده شود. مبلغ کوچک است، اما چون روند و جهت سود را عوض می‌کند، بااهمیت است.</w:t>
+              <w:t xml:space="preserve">خرید یک آچار ۵۰۰ هزار ریالی برای شرکت بهار بی‌اهمیت است و فوراً هزینه می‌شود، حتی اگر ده سال عمر کند؛ سرمایه‌ای کردن و استهلاک‌گیری آن هزینه‌ای بیش از ارزش اطلاعاتش دارد. اما فرض کنید شرکتی دیگر سه سال متوالی زیان‌ده بوده و امسال با کاهش ناچیز ذخیره مطالبات مشکوک‌الوصول، که فقط ۳ درصد سود را تغییر می‌دهد، «سودده» دیده شود. مبلغ کوچک است، اما چون روند و جهت سود را عوض می‌کند، بااهمیت است.</w:t>
             </w:r>
           </w:p>
         </w:tc>
@@ -8284,7 +8284,7 @@
                 <w:szCs w:val="20"/>
                 <w:rtl/>
               </w:rPr>
-              <w:t xml:space="preserve">مدیر مالی آرمان‌کشت در سال پرسود ۵ میلیارد ریال ذخیره اضافی ثبت می‌کند تا «سال بد» را بپوشاند و می‌گوید: «احتیاط می‌کنم.» این احتیاط نیست؛ کم‌نمایی عمدی سود امسال و بیش‌نمایی سود سال بعد است و بی‌طرفی را نقض می‌کند. چارچوب صریحاً می‌گوید اعمال احتیاط، اجازه کم‌نمایی دارایی‌ها یا درآمدها و بیش‌نمایی بدهی‌ها یا هزینه‌ها را نمی‌دهد (چارچوب مفهومی، بند ۲.۱۶).</w:t>
+              <w:t xml:space="preserve">مدیر مالی شرکت بهار در سال پرسود ۵ میلیارد ریال ذخیره اضافی ثبت می‌کند تا «سال بد» را بپوشاند و می‌گوید: «احتیاط می‌کنم.» این احتیاط نیست؛ کم‌نمایی عمدی سود امسال و بیش‌نمایی سود سال بعد است و بی‌طرفی را نقض می‌کند. چارچوب صریحاً می‌گوید اعمال احتیاط، اجازه کم‌نمایی دارایی‌ها یا درآمدها و بیش‌نمایی بدهی‌ها یا هزینه‌ها را نمی‌دهد (چارچوب مفهومی، بند ۲.۱۶).</w:t>
             </w:r>
           </w:p>
         </w:tc>
@@ -8330,7 +8330,7 @@
           <w:szCs w:val="22"/>
           <w:rtl/>
         </w:rPr>
-        <w:t xml:space="preserve"> پدیده نگاه می‌کند، نه شکل حقوقی آن. اگر آرمان‌کشت خط تولیدی را با «اجاره به شرط تملیک» دریافت کند، سند آن به نام شرکت نیست؛ اما اگر کنترل منافع آن را در دست دارد و در برابرش تعهد پرداخت بلندمدت پذیرفته، در عمل آن را با تأمین مالی خریده است و باید هم دارایی و هم بدهی ثبت شود. به این اصل </w:t>
+        <w:t xml:space="preserve"> پدیده نگاه می‌کند، نه شکل حقوقی آن. اگر شرکت بهار خط تولیدی را با «اجاره به شرط تملیک» دریافت کند، سند آن به نام شرکت نیست؛ اما اگر کنترل منافع آن را در دست دارد و در برابرش تعهد پرداخت بلندمدت پذیرفته، در عمل آن را با تأمین مالی خریده است و باید هم دارایی و هم بدهی ثبت شود. به این اصل </w:t>
       </w:r>
       <w:r>
         <w:rPr>
@@ -8797,7 +8797,7 @@
           <w:szCs w:val="22"/>
           <w:rtl/>
         </w:rPr>
-        <w:t xml:space="preserve">چون این ارزیابی‌ها ذاتاً قضاوتی و دشوار است، افراد مختلف مخارج و منافع گزارشگری اقلام خاصی از اطلاعات را متفاوت می‌سنجند. از این‌رو کمیته می‌کوشد مخارج و منافع گزارشگری مالی را به‌طور عام در نظر بگیرد و نه فقط در ارتباط با یک واحد گزارشگر. این بدان معنا نیست که ارزیابی مخارج و منافع همیشه الزامات گزارشگری یکسانی را برای همه واحدهای تجاری توجیه می‌کند؛ اندازه متفاوت واحدها، روش‌های گوناگون افزایش سرمایه (سهامی عام یا غیر سهامی عام)، نیازهای متفاوت استفاده‌کنندگان و عوامل دیگر ممکن است چنین تفاوت‌هایی را مناسب کند (چارچوب مفهومی، بند ۲.۴۳). در سطح یک واحد، مفهوم اهمیت و محدودیت مخارج هر دو در تصمیم‌هایی از نوع خرید آچار ۵۰۰ هزار ریالی آرمان‌کشت دخیل‌اند، که مستقیماً هزینه می‌شود؛ اما این کاربرد مثال ماست و ارزیابی چارچوب در سطح گزارشگری مالی عام است، نه یک واحد.</w:t>
+        <w:t xml:space="preserve">چون این ارزیابی‌ها ذاتاً قضاوتی و دشوار است، افراد مختلف مخارج و منافع گزارشگری اقلام خاصی از اطلاعات را متفاوت می‌سنجند. از این‌رو کمیته می‌کوشد مخارج و منافع گزارشگری مالی را به‌طور عام در نظر بگیرد و نه فقط در ارتباط با یک واحد گزارشگر. این بدان معنا نیست که ارزیابی مخارج و منافع همیشه الزامات گزارشگری یکسانی را برای همه واحدهای تجاری توجیه می‌کند؛ اندازه متفاوت واحدها، روش‌های گوناگون افزایش سرمایه (سهامی عام یا غیر سهامی عام)، نیازهای متفاوت استفاده‌کنندگان و عوامل دیگر ممکن است چنین تفاوت‌هایی را مناسب کند (چارچوب مفهومی، بند ۲.۴۳). در سطح یک واحد، مفهوم اهمیت و محدودیت مخارج هر دو در تصمیم‌هایی از نوع خرید آچار ۵۰۰ هزار ریالی شرکت بهار دخیل‌اند، که مستقیماً هزینه می‌شود؛ اما این کاربرد مثال ماست و ارزیابی چارچوب در سطح گزارشگری مالی عام است، نه یک واحد.</w:t>
       </w:r>
     </w:p>
     <w:p>
@@ -10258,7 +10258,7 @@
           <w:szCs w:val="22"/>
           <w:rtl/>
         </w:rPr>
-        <w:t xml:space="preserve">سومین عبارت «کنترل» است، یعنی توانایی فعلی در هدایت استفاده از منبع اقتصادی و کسب منافعی که ممکن است از آن جریان یابد، و نیز توانایی ممانعت دیگران از این هدایت و کسب منافع. در حسابداری، کنترل مهم‌تر از مالکیت است و معمولاً از توانایی اعمال حقوق قانونی ناشی می‌شود (چارچوب مفهومی، بندهای ۴.۱۹ و ۴.۲۰). دو نمونه زیر از خود کتاب است، نه از متن چارچوب: انبار آرمان‌کشت را شرکت کنترل می‌کند؛ لیفتراکی که با «اجاره به شرط تملیک» تحویل گرفته نیز دارایی شرکت است، حتی بدون سند مالکیت. اما «مهارت‌های مهندسان کلیدی» دارایی آرمان‌کشت نیست؛ آن‌ها هر روز می‌توانند شرکت را ترک کنند و شرکت نمی‌تواند هدایت استفاده از این مهارت‌ها یا ممانعت دیگران را در دست بگیرد.</w:t>
+        <w:t xml:space="preserve">سومین عبارت «کنترل» است، یعنی توانایی فعلی در هدایت استفاده از منبع اقتصادی و کسب منافعی که ممکن است از آن جریان یابد، و نیز توانایی ممانعت دیگران از این هدایت و کسب منافع. در حسابداری، کنترل مهم‌تر از مالکیت است و معمولاً از توانایی اعمال حقوق قانونی ناشی می‌شود (چارچوب مفهومی، بندهای ۴.۱۹ و ۴.۲۰). دو نمونه زیر از خود کتاب است، نه از متن چارچوب: انبار شرکت بهار را شرکت کنترل می‌کند؛ لیفتراکی که با «اجاره به شرط تملیک» تحویل گرفته نیز دارایی شرکت است، حتی بدون سند مالکیت. اما «مهارت‌های مهندسان کلیدی» دارایی شرکت بهار نیست؛ آن‌ها هر روز می‌توانند شرکت را ترک کنند و شرکت نمی‌تواند هدایت استفاده از این مهارت‌ها یا ممانعت دیگران را در دست بگیرد.</w:t>
       </w:r>
     </w:p>
     <w:p>
@@ -10583,7 +10583,7 @@
                 <w:szCs w:val="21"/>
                 <w:rtl/>
               </w:rPr>
-              <w:t xml:space="preserve">مثال: تعهد عرفی در آرمان‌کشت</w:t>
+              <w:t xml:space="preserve">مثال: تعهد عرفی در شرکت بهار</w:t>
             </w:r>
           </w:p>
           <w:p>
@@ -10599,7 +10599,7 @@
                 <w:szCs w:val="20"/>
                 <w:rtl/>
               </w:rPr>
-              <w:t xml:space="preserve">آرمان‌کشت متوجه می‌شود یک قطعه در تراکتورهای فروخته‌شده نقص دارد. گارانتی تمام شده و هیچ قانونی شرکت را ملزم نمی‌کند، اما مدیرعامل در نشستی خبری اعلام می‌کند شرکت قطعه را رایگان تعویض می‌کند. با این اعلام عمومی، شرکت دیگر توانایی عملی اجتناب از این تعهد را ندارد: رویداد گذشته رخ داده، تعهد فعلی ایجاد شده و انتقال منبع اقتصادی لازم است. بدهی باید شناسایی شود، هرچند قانون الزامی نکرده است.</w:t>
+              <w:t xml:space="preserve">شرکت بهار متوجه می‌شود یک قطعه در تراکتورهای فروخته‌شده نقص دارد. گارانتی تمام شده و هیچ قانونی شرکت را ملزم نمی‌کند، اما مدیرعامل در نشستی خبری اعلام می‌کند شرکت قطعه را رایگان تعویض می‌کند. با این اعلام عمومی، شرکت دیگر توانایی عملی اجتناب از این تعهد را ندارد: رویداد گذشته رخ داده، تعهد فعلی ایجاد شده و انتقال منبع اقتصادی لازم است. بدهی باید شناسایی شود، هرچند قانون الزامی نکرده است.</w:t>
             </w:r>
           </w:p>
         </w:tc>
@@ -11210,7 +11210,7 @@
                 <w:szCs w:val="20"/>
                 <w:rtl/>
               </w:rPr>
-              <w:t xml:space="preserve">آرمان‌کشت قراردادی برای خرید ورق فولاد با قیمت ثابت امضا می‌کند. تا زمانی که هیچ‌یک از دو طرف عمل نکرده، قرارداد اجرانشده است و حق دریافت فولاد با تعهد پرداخت بها یک واحد حساب می‌سازد. اگر قیمت بازار بالا برود و شرایط قرارداد برای آرمان‌کشت مطلوب شود، ترکیب یک دارایی است؛ اگر قیمت بازار پایین بیاید، ترکیب یک بدهی است. وقتی فولاد تحویل شود، حق دریافت فولاد پایان می‌یابد و جای آن را فولاد و تعهد پرداخت بها می‌گیرد.</w:t>
+              <w:t xml:space="preserve">شرکت بهار قراردادی برای خرید ورق فولاد با قیمت ثابت امضا می‌کند. تا زمانی که هیچ‌یک از دو طرف عمل نکرده، قرارداد اجرانشده است و حق دریافت فولاد با تعهد پرداخت بها یک واحد حساب می‌سازد. اگر قیمت بازار بالا برود و شرایط قرارداد برای شرکت بهار مطلوب شود، ترکیب یک دارایی است؛ اگر قیمت بازار پایین بیاید، ترکیب یک بدهی است. وقتی فولاد تحویل شود، حق دریافت فولاد پایان می‌یابد و جای آن را فولاد و تعهد پرداخت بها می‌گیرد.</w:t>
             </w:r>
           </w:p>
         </w:tc>
@@ -12356,7 +12356,7 @@
           <w:szCs w:val="22"/>
           <w:rtl/>
         </w:rPr>
-        <w:t xml:space="preserve">برند ساخته‌شده توسط خود آرمان‌کشت را در نظر بگیرید. ممکن است با تعریف دارایی سازگار باشد، چون حقی است که قابلیت تولید منافع دارد و شرکت آن را کنترل می‌کند. اما فرض کنید اندازه‌گیری آن به‌طور صادقانه و با هزینه‌ای معقول ممکن نباشد و همه مقادیر در دسترس چنان نامطمئن باشند که هیچ‌یک، حتی با توصیف برآوردها، اطلاعات مفیدی ندهد؛ این همان «شرایط محدود» بند ۵.۲۲ است و در آن شناخت اطلاعات مفید فراهم نمی‌کند. اگر مبلغ دیگری با عدم اطمینان کمتر در دسترس باشد، چارچوب به‌جای ترک شناخت، آن مبلغ را همراه با توضیح لازم ترجیح می‌دهد (بند ۵.۲۱). به این ترتیب «تعریف» لازم است، اما کافی نیست. همین منطق به ما کمک می‌کند «تطابق هزینه‌ها با درآمدها» را درست بفهمیم: وقتی فروش نقدی کالا هم درآمد (از شناخت یک دارایی، یعنی نقد) و هم هزینه (از قطع شناخت دارایی دیگر، یعنی کالا) ایجاد می‌کند، می‌گوییم درآمد و هزینه هم‌زمان شناسایی شده‌اند و این را گاهی «تطابق» می‌نامند (چارچوب مفهومی، بند ۵.۵). اما این همزمانی نتیجه‌ی شناخت تغییرات در دارایی‌ها و بدهی‌هاست و اجازه نمی‌دهد قلمی که تعریف دارایی یا بدهی را ندارد، مانند «هزینه به تعویق‌افتاده»، در صورت وضعیت مالی بیاید.</w:t>
+        <w:t xml:space="preserve">برند ساخته‌شده توسط خود شرکت بهار را در نظر بگیرید. ممکن است با تعریف دارایی سازگار باشد، چون حقی است که قابلیت تولید منافع دارد و شرکت آن را کنترل می‌کند. اما فرض کنید اندازه‌گیری آن به‌طور صادقانه و با هزینه‌ای معقول ممکن نباشد و همه مقادیر در دسترس چنان نامطمئن باشند که هیچ‌یک، حتی با توصیف برآوردها، اطلاعات مفیدی ندهد؛ این همان «شرایط محدود» بند ۵.۲۲ است و در آن شناخت اطلاعات مفید فراهم نمی‌کند. اگر مبلغ دیگری با عدم اطمینان کمتر در دسترس باشد، چارچوب به‌جای ترک شناخت، آن مبلغ را همراه با توضیح لازم ترجیح می‌دهد (بند ۵.۲۱). به این ترتیب «تعریف» لازم است، اما کافی نیست. همین منطق به ما کمک می‌کند «تطابق هزینه‌ها با درآمدها» را درست بفهمیم: وقتی فروش نقدی کالا هم درآمد (از شناخت یک دارایی، یعنی نقد) و هم هزینه (از قطع شناخت دارایی دیگر، یعنی کالا) ایجاد می‌کند، می‌گوییم درآمد و هزینه هم‌زمان شناسایی شده‌اند و این را گاهی «تطابق» می‌نامند (چارچوب مفهومی، بند ۵.۵). اما این همزمانی نتیجه‌ی شناخت تغییرات در دارایی‌ها و بدهی‌هاست و اجازه نمی‌دهد قلمی که تعریف دارایی یا بدهی را ندارد، مانند «هزینه به تعویق‌افتاده»، در صورت وضعیت مالی بیاید.</w:t>
       </w:r>
     </w:p>
     <w:p>
@@ -12410,7 +12410,7 @@
           <w:szCs w:val="22"/>
           <w:rtl/>
         </w:rPr>
-        <w:t xml:space="preserve">اگر آرمان‌کشت مطالبات خود را به بانک بفروشد و کنترل و ریسک آن را کاملاً منتقل کند، مطالبات حذف می‌شود؛ اما چارچوب دو وضعیت را نمونه می‌آورد که در آن‌ها واحد تجاری به‌ظاهر دارایی را منتقل کرده، ولی دارایی همچنان دارایی او باقی می‌ماند. در وضعیت نخست، واحد تجاری دارایی را به‌ظاهر منتقل کرده ولی همچنان در معرض نوسان‌های عمده، مثبت یا منفی، در مبلغ منافع اقتصادی آن دارایی است؛ این وضع گاه نشان می‌دهد کنترل ادامه دارد (بند ۴.۲۴). اگر آرمان‌کشت مطالبات را فروخته باشد اما زیان وصول‌نشدن آن را همچنان خودش بپذیرد، ممکن است هنوز آن را کنترل کند و مطالبات باید بماند. در وضعیت دوم، دارایی به شخص دیگری منتقل شده که آن را به‌عنوان نماینده واحد تجاری نگهداری می‌کند؛ در این حالت انتقال‌دهنده هنوز دارایی را کنترل می‌کند (بند ۴.۲۵). در چنین مواردی قطع شناخت مناسب نیست، زیرا یکی از دو هدف قطع شناخت یا هر دو محقق نشده است (چارچوب مفهومی، بندهای ۵.۲۹ و ۵.۳۰).</w:t>
+        <w:t xml:space="preserve">اگر شرکت بهار مطالبات خود را به بانک بفروشد و کنترل و ریسک آن را کاملاً منتقل کند، مطالبات حذف می‌شود؛ اما چارچوب دو وضعیت را نمونه می‌آورد که در آن‌ها واحد تجاری به‌ظاهر دارایی را منتقل کرده، ولی دارایی همچنان دارایی او باقی می‌ماند. در وضعیت نخست، واحد تجاری دارایی را به‌ظاهر منتقل کرده ولی همچنان در معرض نوسان‌های عمده، مثبت یا منفی، در مبلغ منافع اقتصادی آن دارایی است؛ این وضع گاه نشان می‌دهد کنترل ادامه دارد (بند ۴.۲۴). اگر شرکت بهار مطالبات را فروخته باشد اما زیان وصول‌نشدن آن را همچنان خودش بپذیرد، ممکن است هنوز آن را کنترل کند و مطالبات باید بماند. در وضعیت دوم، دارایی به شخص دیگری منتقل شده که آن را به‌عنوان نماینده واحد تجاری نگهداری می‌کند؛ در این حالت انتقال‌دهنده هنوز دارایی را کنترل می‌کند (بند ۴.۲۵). در چنین مواردی قطع شناخت مناسب نیست، زیرا یکی از دو هدف قطع شناخت یا هر دو محقق نشده است (چارچوب مفهومی، بندهای ۵.۲۹ و ۵.۳۰).</w:t>
       </w:r>
     </w:p>
     <w:tbl>
@@ -12649,7 +12649,7 @@
           <w:szCs w:val="22"/>
           <w:rtl/>
         </w:rPr>
-        <w:t xml:space="preserve">نخستین پرسش این است که دفتر حسابداری آرمان‌کشت، دفتر چه کسی است؟ اگر مالک شرکت یک روز خانه‌اش را بخرد یا برای فرزندش شهریه بپردازد، آیا این پرداخت‌ها در حساب‌های شرکت جا دارند؟ </w:t>
+        <w:t xml:space="preserve">نخستین پرسش این است که دفتر حسابداری شرکت بهار، دفتر چه کسی است؟ اگر مالک شرکت یک روز خانه‌اش را بخرد یا برای فرزندش شهریه بپردازد، آیا این پرداخت‌ها در حساب‌های شرکت جا دارند؟ </w:t>
       </w:r>
       <w:r>
         <w:rPr>
@@ -12686,7 +12686,7 @@
           <w:szCs w:val="22"/>
           <w:rtl/>
         </w:rPr>
-        <w:t xml:space="preserve">اما مرز این شخصیت کجاست؟ نگاه کلاسیک مرز را بسیار تنگ می‌کشد: فقط رویدادهایی که اثر مالی مستقیم بر خود شرکت دارند، مانند خرید و فروش و پرداخت حقوق. نگاه نوین، که از نیاز استفاده‌کنندگان آغاز می‌کند، مرز را وسیع‌تر می‌بیند. چارچوب مفهومی هم همین را می‌گوید: وقتی تعیین محدوده واحد گزارشگر دشوار است، باید به نیازهای اطلاعاتی استفاده‌کنندگان اصلی نگاه کرد، و این محدوده نباید مجموعه‌ای اختیاری یا ناکامل از فعالیت‌های اقتصادی باشد (چارچوب مفهومی، بندهای ۳.۱۳ و ۳.۱۴). به همین دلیل وقتی آرمان‌کشت چند شرکت تابعه دارد، صورت‌های مالی تلفیقی گروه تهیه می‌شود؛ چون سرمایه‌گذار آرمان‌کشت در واقع روی کل گروه سرمایه‌گذاری کرده است. همین رویکرد است که گاهی مرز را از سود مالی هم فراتر می‌برد و شاخه‌هایی مانند حسابداری منابع انسانی و حسابداری اجتماعی و محیط‌زیستی را پدید آورده است.</w:t>
+        <w:t xml:space="preserve">اما مرز این شخصیت کجاست؟ نگاه کلاسیک مرز را بسیار تنگ می‌کشد: فقط رویدادهایی که اثر مالی مستقیم بر خود شرکت دارند، مانند خرید و فروش و پرداخت حقوق. نگاه نوین، که از نیاز استفاده‌کنندگان آغاز می‌کند، مرز را وسیع‌تر می‌بیند. چارچوب مفهومی هم همین را می‌گوید: وقتی تعیین محدوده واحد گزارشگر دشوار است، باید به نیازهای اطلاعاتی استفاده‌کنندگان اصلی نگاه کرد، و این محدوده نباید مجموعه‌ای اختیاری یا ناکامل از فعالیت‌های اقتصادی باشد (چارچوب مفهومی، بندهای ۳.۱۳ و ۳.۱۴). به همین دلیل وقتی شرکت بهار چند شرکت تابعه دارد، صورت‌های مالی تلفیقی گروه تهیه می‌شود؛ چون سرمایه‌گذار شرکت بهار در واقع روی کل گروه سرمایه‌گذاری کرده است. همین رویکرد است که گاهی مرز را از سود مالی هم فراتر می‌برد و شاخه‌هایی مانند حسابداری منابع انسانی و حسابداری اجتماعی و محیط‌زیستی را پدید آورده است.</w:t>
       </w:r>
     </w:p>
     <w:p>
@@ -12884,7 +12884,7 @@
           <w:szCs w:val="22"/>
           <w:rtl/>
         </w:rPr>
-        <w:t xml:space="preserve">شاید بپرسید این فرض چه تفاوتی در عدد‌ها ایجاد می‌کند. پاسخ این است که بسیاری از رفتارهای معمول حسابداران روی همین فرض سوار است. اگر آرمان‌کشت قرار بود فردا تعطیل شود، ممکن بود لازم شود انبار و ماشین‌آلاتش را مثلاً به قیمت تصفیه، یعنی حراج فوری، گزارش کنیم؛ چارچوب فقط از «مبنای متفاوت» سخن می‌گوید و قیمت تصفیه نمونه‌ای مصداقی از این مبنا است، اما الزام توصیف مبنای به‌کاررفته در صورت‌های مالی (بند ۳.۹) در هر حال برقرار می‌ماند. اما چون فرض می‌کنیم شرکت می‌ماند و از آن دارایی‌ها برای تولید تراکتور استفاده می‌کند، قیمت فروش فوری آن‌ها اهمیتی ندارد و ثبت دارایی به بهای خرید معنا پیدا می‌کند. به همین ترتیب تفکیک دارایی‌ها به جاری و غیرجاری فقط وقتی معنا دارد که «بلندمدت» آینده‌ای داشته باشد، و وقتی بهای یک دستگاه را در ده سال مستهلک می‌کنیم، در واقع پیش‌بینی کرده‌ایم که شرکت ده سال دیگر هم هست تا از آن دستگاه بهره ببرد. این فرض البته مثل هر فرضی نقدپذیر است و برخی نظریه‌پردازان، از جمله چمبرز، آن را بیشتر یک پیش‌بینی می‌دانند تا یک واقعیت اثبات‌شده (این داوری از مؤلفان است و در چارچوب نیامده است)؛ در هر حال تا زمانی که قصد یا ضرورت انحلال یا توقف عملیات در میان نیست، حسابداری روی این فرض بنا می‌شود.</w:t>
+        <w:t xml:space="preserve">شاید بپرسید این فرض چه تفاوتی در عدد‌ها ایجاد می‌کند. پاسخ این است که بسیاری از رفتارهای معمول حسابداران روی همین فرض سوار است. اگر شرکت بهار قرار بود فردا تعطیل شود، ممکن بود لازم شود انبار و ماشین‌آلاتش را مثلاً به قیمت تصفیه، یعنی حراج فوری، گزارش کنیم؛ چارچوب فقط از «مبنای متفاوت» سخن می‌گوید و قیمت تصفیه نمونه‌ای مصداقی از این مبنا است، اما الزام توصیف مبنای به‌کاررفته در صورت‌های مالی (بند ۳.۹) در هر حال برقرار می‌ماند. اما چون فرض می‌کنیم شرکت می‌ماند و از آن دارایی‌ها برای تولید تراکتور استفاده می‌کند، قیمت فروش فوری آن‌ها اهمیتی ندارد و ثبت دارایی به بهای خرید معنا پیدا می‌کند. به همین ترتیب تفکیک دارایی‌ها به جاری و غیرجاری فقط وقتی معنا دارد که «بلندمدت» آینده‌ای داشته باشد، و وقتی بهای یک دستگاه را در ده سال مستهلک می‌کنیم، در واقع پیش‌بینی کرده‌ایم که شرکت ده سال دیگر هم هست تا از آن دستگاه بهره ببرد. این فرض البته مثل هر فرضی نقدپذیر است و برخی نظریه‌پردازان، از جمله چمبرز، آن را بیشتر یک پیش‌بینی می‌دانند تا یک واقعیت اثبات‌شده (این داوری از مؤلفان است و در چارچوب نیامده است)؛ در هر حال تا زمانی که قصد یا ضرورت انحلال یا توقف عملیات در میان نیست، حسابداری روی این فرض بنا می‌شود.</w:t>
       </w:r>
     </w:p>
     <w:p>
@@ -13231,7 +13231,7 @@
           <w:szCs w:val="22"/>
           <w:rtl/>
         </w:rPr>
-        <w:t xml:space="preserve"> در روایت سنتی می‌گوید معاملات و رویدادهای مالی با واحد پول رایج، مانند ریال یا دلار، اندازه‌گیری و گزارش می‌شوند. پول مخرج مشترکی است که اجازه می‌دهد اقلام ناهمگنی مثل زمین، تراکتور و میز اداری را با هم جمع بزنیم و بگوییم مجموع دارایی‌های آرمان‌کشت چقدر است. همین یکسان‌سازی قابل مقایسه بودن گزارش‌ها را بسیار بالا می‌برد. اما این فرض دو پاشنه‌ی آشیل هم دارد که منتقدان همیشه به آن حمله می‌کنند.</w:t>
+        <w:t xml:space="preserve"> در روایت سنتی می‌گوید معاملات و رویدادهای مالی با واحد پول رایج، مانند ریال یا دلار، اندازه‌گیری و گزارش می‌شوند. پول مخرج مشترکی است که اجازه می‌دهد اقلام ناهمگنی مثل زمین، تراکتور و میز اداری را با هم جمع بزنیم و بگوییم مجموع دارایی‌های شرکت بهار چقدر است. همین یکسان‌سازی قابل مقایسه بودن گزارش‌ها را بسیار بالا می‌برد. اما این فرض دو پاشنه‌ی آشیل هم دارد که منتقدان همیشه به آن حمله می‌کنند.</w:t>
       </w:r>
     </w:p>
     <w:p>
@@ -14333,7 +14333,7 @@
           <w:szCs w:val="22"/>
           <w:rtl/>
         </w:rPr>
-        <w:t xml:space="preserve">بهای جاری، همانند بهای تمام‌شده تاریخی، یک ارزش ورودی است و قیمت‌هایی در بازار را منعکس می‌کند که واحد تجاری به آن قیمت دارایی را تحصیل یا بدهی را تقبل می‌کند؛ از این‌رو با ارزش منصفانه، ارزش بکارگیری و ارزش ایفا، که ارزش‌های خروجی‌اند، فرق دارد. با این حال، برخلاف بهای تاریخی، شرایط تاریخ اندازه‌گیری را منعکس می‌کند. (چارچوب مفهومی، بند ۶.۲۱) گاه بهای جاری را نمی‌توان مستقیماً از قیمت‌های بازار فعال مشاهده کرد و باید غیرمستقیم تعیین شود؛ برای مثال، اگر فقط قیمت دارایی‌های نو در دسترس باشد، برای برآورد بهای جاری دارایی مستعمل باید قیمت دارایی نو را برای انعکاس عمر و وضعیت کنونی دارایی واحد تجاری تعدیل کرد. (چارچوب مفهومی، بند ۶.۲۲) مثال انبار آرمان‌کشت دقیقاً همین تعدیل را نشان می‌دهد و تفاوت این سه مبنا را بهتر از هر تعریفی روشن می‌کند.</w:t>
+        <w:t xml:space="preserve">بهای جاری، همانند بهای تمام‌شده تاریخی، یک ارزش ورودی است و قیمت‌هایی در بازار را منعکس می‌کند که واحد تجاری به آن قیمت دارایی را تحصیل یا بدهی را تقبل می‌کند؛ از این‌رو با ارزش منصفانه، ارزش بکارگیری و ارزش ایفا، که ارزش‌های خروجی‌اند، فرق دارد. با این حال، برخلاف بهای تاریخی، شرایط تاریخ اندازه‌گیری را منعکس می‌کند. (چارچوب مفهومی، بند ۶.۲۱) گاه بهای جاری را نمی‌توان مستقیماً از قیمت‌های بازار فعال مشاهده کرد و باید غیرمستقیم تعیین شود؛ برای مثال، اگر فقط قیمت دارایی‌های نو در دسترس باشد، برای برآورد بهای جاری دارایی مستعمل باید قیمت دارایی نو را برای انعکاس عمر و وضعیت کنونی دارایی واحد تجاری تعدیل کرد. (چارچوب مفهومی، بند ۶.۲۲) مثال انبار شرکت بهار دقیقاً همین تعدیل را نشان می‌دهد و تفاوت این سه مبنا را بهتر از هر تعریفی روشن می‌کند.</w:t>
       </w:r>
     </w:p>
     <w:tbl>
@@ -14394,7 +14394,7 @@
                 <w:szCs w:val="21"/>
                 <w:rtl/>
               </w:rPr>
-              <w:t xml:space="preserve">مثال: انبار آرمان‌کشت، چهار «عدد»</w:t>
+              <w:t xml:space="preserve">مثال: انبار شرکت بهار، چهار «عدد»</w:t>
             </w:r>
           </w:p>
           <w:p>
@@ -14410,7 +14410,7 @@
                 <w:szCs w:val="20"/>
                 <w:rtl/>
               </w:rPr>
-              <w:t xml:space="preserve">آرمان‌کشت سه سال پیش انباری را به بهای ۱۰ میلیارد ریال ساخته است (عمر مفید ۱۰ سال، بدون ارزش اسقاط). امروز کدام عدد را در صورت وضعیت مالی بیاوریم؟ بر اساس </w:t>
+              <w:t xml:space="preserve">شرکت بهار سه سال پیش انباری را به بهای ۱۰ میلیارد ریال ساخته است (عمر مفید ۱۰ سال، بدون ارزش اسقاط). امروز کدام عدد را در صورت وضعیت مالی بیاوریم؟ بر اساس </w:t>
             </w:r>
             <w:r>
               <w:rPr>
@@ -16892,7 +16892,7 @@
                 <w:szCs w:val="20"/>
                 <w:rtl/>
               </w:rPr>
-              <w:t xml:space="preserve">سهام یک شرکت بورسی را در دست آرمان‌کشت در نظر بگیرید. اگر ارزش منصفانه‌ی یک دارایی را بتوان با مشاهده‌ی مستقیم قیمت‌ها در بازار فعال تعیین کرد، در اندازه‌گیری آن ارزش هیچ عدم‌اطمینان اندازه‌گیری وجود ندارد، حتی اگر میزان وجه نقدی که آن دارایی سرانجام ایجاد خواهد کرد نامطمئن باشد و بنابراین عدم‌اطمینان نتیجه برقرار باشد. (چارچوب مفهومی، بند ۶.۶۲)</w:t>
+              <w:t xml:space="preserve">سهام یک شرکت بورسی را در دست شرکت بهار در نظر بگیرید. اگر ارزش منصفانه‌ی یک دارایی را بتوان با مشاهده‌ی مستقیم قیمت‌ها در بازار فعال تعیین کرد، در اندازه‌گیری آن ارزش هیچ عدم‌اطمینان اندازه‌گیری وجود ندارد، حتی اگر میزان وجه نقدی که آن دارایی سرانجام ایجاد خواهد کرد نامطمئن باشد و بنابراین عدم‌اطمینان نتیجه برقرار باشد. (چارچوب مفهومی، بند ۶.۶۲)</w:t>
             </w:r>
           </w:p>
         </w:tc>
@@ -17070,7 +17070,7 @@
                 <w:szCs w:val="20"/>
                 <w:rtl/>
               </w:rPr>
-              <w:t xml:space="preserve">فرض کنید شرکت همسایه‌ی آرمان‌کشت انبار کاملاً همانندی را شش سال پیش، با بهای کمتر، ساخته باشد. هر دو انبار امروز کارکرد یکسانی دارند، اما به بهای تاریخی، دو مبلغ دفتری متفاوت در صورت وضعیت مالی دو شرکت می‌نشیند؛ تحلیلگر باید خودش اثر زمان ساخت را از مقایسه بیرون بکشد. این همان کاهش قابل مقایسه بودن بند ۶.۷۱ است. در بهای جاری، هر دو انبار به یک مبلغ گزارش می‌شوند.</w:t>
+              <w:t xml:space="preserve">فرض کنید شرکت همسایه‌ی شرکت بهار انبار کاملاً همانندی را شش سال پیش، با بهای کمتر، ساخته باشد. هر دو انبار امروز کارکرد یکسانی دارند، اما به بهای تاریخی، دو مبلغ دفتری متفاوت در صورت وضعیت مالی دو شرکت می‌نشیند؛ تحلیلگر باید خودش اثر زمان ساخت را از مقایسه بیرون بکشد. این همان کاهش قابل مقایسه بودن بند ۶.۷۱ است. در بهای جاری، هر دو انبار به یک مبلغ گزارش می‌شوند.</w:t>
             </w:r>
           </w:p>
         </w:tc>
@@ -17113,7 +17113,7 @@
           <w:szCs w:val="22"/>
           <w:rtl/>
         </w:rPr>
-        <w:t xml:space="preserve">ارزش بکارگیری دشواری ویژه‌ای دارد. در بسیاری موارد نمی‌توان آن را به‌صورت معنادار برای دارایی منفردی تعیین کرد که با دارایی‌های دیگر ترکیب شده است؛ در عوض برای گروهی از دارایی‌ها محاسبه می‌شود و سپس شاید لازم باشد نتیجه به هر دارایی تخصیص یابد، که فرایندی ذهنی و اختیاری است و ممکن است ناخواسته اثر هم‌افزایی با دارایی‌های دیگر گروه را هم منعکس کند. به همین دلایل، ارزش بکارگیری ممکن است برای تجدید اندازه‌گیری منظم این‌گونه دارایی‌ها مبنای کاربردی نباشد. با این حال، در موقعیت‌های خاص، مانند آزمون کاهش ارزش که می‌خواهد بداند بهای تمام‌شده‌ی تاریخی به‌طور کامل بازیافتنی است یا نه، ممکن است سودمند باشد. (چارچوب مفهومی، بند ۶.۷۵) از همین‌جا روشن می‌شود چرا مثال انبار آرمان‌کشت را که در بخش ۱-۱۰-۲ آمد با احتیاط خواندیم.</w:t>
+        <w:t xml:space="preserve">ارزش بکارگیری دشواری ویژه‌ای دارد. در بسیاری موارد نمی‌توان آن را به‌صورت معنادار برای دارایی منفردی تعیین کرد که با دارایی‌های دیگر ترکیب شده است؛ در عوض برای گروهی از دارایی‌ها محاسبه می‌شود و سپس شاید لازم باشد نتیجه به هر دارایی تخصیص یابد، که فرایندی ذهنی و اختیاری است و ممکن است ناخواسته اثر هم‌افزایی با دارایی‌های دیگر گروه را هم منعکس کند. به همین دلایل، ارزش بکارگیری ممکن است برای تجدید اندازه‌گیری منظم این‌گونه دارایی‌ها مبنای کاربردی نباشد. با این حال، در موقعیت‌های خاص، مانند آزمون کاهش ارزش که می‌خواهد بداند بهای تمام‌شده‌ی تاریخی به‌طور کامل بازیافتنی است یا نه، ممکن است سودمند باشد. (چارچوب مفهومی، بند ۶.۷۵) از همین‌جا روشن می‌شود چرا مثال انبار شرکت بهار را که در بخش ۱-۱۰-۲ آمد با احتیاط خواندیم.</w:t>
       </w:r>
     </w:p>
     <w:p>
@@ -17299,7 +17299,7 @@
                 <w:szCs w:val="20"/>
                 <w:rtl/>
               </w:rPr>
-              <w:t xml:space="preserve">فرض کنید دولت قطعه زمینی را به‌رایگان به آرمان‌کشت واگذار کند. بهای تمام‌شده‌ی تاریخی صفر ریال بیان صادقانه‌ای از این دارایی نیست؛ پس ارزش جاری زمین در تاریخ دریافت به‌عنوان بهای تمام‌شده‌ی مفروض به کار می‌رود، و تفاوت آن با مابه‌ازای پرداختی (که صفر است) در شناخت اولیه شناسایی می‌شود. این مثال تصویری از رویدادهای بند ۶.۸۰ است؛ شیوه‌ی دقیق شناسایی آن به استانداردهای مربوط واگذار می‌شود.</w:t>
+              <w:t xml:space="preserve">فرض کنید دولت قطعه زمینی را به‌رایگان به شرکت بهار واگذار کند. بهای تمام‌شده‌ی تاریخی صفر ریال بیان صادقانه‌ای از این دارایی نیست؛ پس ارزش جاری زمین در تاریخ دریافت به‌عنوان بهای تمام‌شده‌ی مفروض به کار می‌رود، و تفاوت آن با مابه‌ازای پرداختی (که صفر است) در شناخت اولیه شناسایی می‌شود. این مثال تصویری از رویدادهای بند ۶.۸۰ است؛ شیوه‌ی دقیق شناسایی آن به استانداردهای مربوط واگذار می‌شود.</w:t>
             </w:r>
           </w:p>
         </w:tc>
@@ -17518,7 +17518,7 @@
                 <w:szCs w:val="20"/>
                 <w:rtl/>
               </w:rPr>
-              <w:t xml:space="preserve">این بند به یک سوءبرداشت رایج پاسخ می‌دهد: عدد حقوق مالکانه در ترازنامه‌ی آرمان‌کشت نه قیمت سهام آن در بورس است و نه مبلغی که با فروش کل شرکت به دست می‌آید. حقوق مالکانه فقط باقیمانده‌ی «دارایی‌های شناسایی‌شده منهای بدهی‌های شناسایی‌شده» است؛ و چون برخی دارایی‌ها اصلاً شناسایی نمی‌شوند (مانند برند ساخته‌شده توسط خود شرکت)، این باقیمانده نمی‌تواند ارزش شرکت را نشان دهد.</w:t>
+              <w:t xml:space="preserve">این بند به یک سوءبرداشت رایج پاسخ می‌دهد: عدد حقوق مالکانه در ترازنامه‌ی شرکت بهار نه قیمت سهام آن در بورس است و نه مبلغی که با فروش کل شرکت به دست می‌آید. حقوق مالکانه فقط باقیمانده‌ی «دارایی‌های شناسایی‌شده منهای بدهی‌های شناسایی‌شده» است؛ و چون برخی دارایی‌ها اصلاً شناسایی نمی‌شوند (مانند برند ساخته‌شده توسط خود شرکت)، این باقیمانده نمی‌تواند ارزش شرکت را نشان دهد.</w:t>
             </w:r>
           </w:p>
         </w:tc>
@@ -17742,7 +17742,7 @@
                 <w:szCs w:val="20"/>
                 <w:rtl/>
               </w:rPr>
-              <w:t xml:space="preserve">آرمان‌کشت از یک مشتری ۱۰ میلیارد ریال طلب دارد. با احتمال ۶۰ درصد کل مبلغ را وصول می‌کند، با احتمال ۳۰ درصد ۵ میلیارد و با احتمال ۱۰ درصد هیچ. ارزش مورد انتظار (۰٫۶ × ۱۰) + (۰٫۳ × ۵) + (۰٫۱ × ۰) = ۷٫۵ میلیارد ریال است؛ محتمل‌ترین نتیجه ۱۰ میلیارد است؛ و بیشینه‌ی مبلغی که احتمال دریافت آن بیش از ۵۰ درصد است نیز ۱۰ میلیارد است (احتمال دریافت دست‌کم ۱۰ میلیارد ۶۰ درصد است). سه برآورد سه عدد متفاوت می‌دهند، و هیچ‌کدام دامنه‌ی نتایج ممکن را نشان نمی‌دهد.</w:t>
+              <w:t xml:space="preserve">شرکت بهار از یک مشتری ۱۰ میلیارد ریال طلب دارد. با احتمال ۶۰ درصد کل مبلغ را وصول می‌کند، با احتمال ۳۰ درصد ۵ میلیارد و با احتمال ۱۰ درصد هیچ. ارزش مورد انتظار (۰٫۶ × ۱۰) + (۰٫۳ × ۵) + (۰٫۱ × ۰) = ۷٫۵ میلیارد ریال است؛ محتمل‌ترین نتیجه ۱۰ میلیارد است؛ و بیشینه‌ی مبلغی که احتمال دریافت آن بیش از ۵۰ درصد است نیز ۱۰ میلیارد است (احتمال دریافت دست‌کم ۱۰ میلیارد ۶۰ درصد است). سه برآورد سه عدد متفاوت می‌دهند، و هیچ‌کدام دامنه‌ی نتایج ممکن را نشان نمی‌دهد.</w:t>
             </w:r>
           </w:p>
         </w:tc>
@@ -17846,7 +17846,7 @@
           <w:szCs w:val="22"/>
           <w:rtl/>
         </w:rPr>
-        <w:t xml:space="preserve">به ماجرای شب ۲۹ اسفند برگردیم. دو حسابدار آرمان‌کشت درباره‌ی چیزی اختلاف داشتند که به نام «شناسایی» می‌شناسیم: کِی یک رویداد آن‌قدر واقعی می‌شود که در صورت‌های مالی بنشیند؟ در بخش ۱-۸ دیدیم که شناسایی در سطح کلی چگونه کار می‌کند. حالا دو موردی را بررسی می‌کنیم که بیش از هر چیز سود را می‌سازند و می‌شکنند: درآمد، که پاداش است، و هزینه، که بهای رسیدن به آن پاداش است.</w:t>
+        <w:t xml:space="preserve">به ماجرای شب ۲۹ اسفند برگردیم. دو حسابدار شرکت بهار درباره‌ی چیزی اختلاف داشتند که به نام «شناسایی» می‌شناسیم: کِی یک رویداد آن‌قدر واقعی می‌شود که در صورت‌های مالی بنشیند؟ در بخش ۱-۸ دیدیم که شناسایی در سطح کلی چگونه کار می‌کند. حالا دو موردی را بررسی می‌کنیم که بیش از هر چیز سود را می‌سازند و می‌شکنند: درآمد، که پاداش است، و هزینه، که بهای رسیدن به آن پاداش است.</w:t>
       </w:r>
     </w:p>
     <w:p>
@@ -17887,7 +17887,7 @@
           <w:szCs w:val="22"/>
           <w:rtl/>
         </w:rPr>
-        <w:t xml:space="preserve">شناسایی درآمد حساس‌ترین بخش حسابداری است، چون زمان آن مستقیماً بر سود، عملکرد مالی و تصمیم‌های استفاده‌کنندگان اثر می‌گذارد. نکته‌ی اصلی این است که شناسایی درآمد به زمان دریافت وجه نقد ربطی ندارد و بر ایفای تعهد در برابر مشتری استوار است. چارچوب مفهومی هم می‌گوید درآمد وقتی شناسایی می‌شود که قلم با تعریف درآمد (افزایش دارایی‌ها یا کاهش بدهی‌ها که به افزایش حقوق مالکانه می‌انجامد، به‌جز آورده مالکان) سازگار باشد و اطلاعات مربوط و بیان صادقانه فراهم کند (چارچوب مفهومی، بندهای ۴.۶۸، ۵.۶ و ۵.۷). پس برای تراکتور ۲۸ اسفند، پرسش اصلی «پول آمده یا نه؟» نیست، بلکه این است که آرمان‌کشت تعهد خود را ایفا کرده است یا نه.</w:t>
+        <w:t xml:space="preserve">شناسایی درآمد حساس‌ترین بخش حسابداری است، چون زمان آن مستقیماً بر سود، عملکرد مالی و تصمیم‌های استفاده‌کنندگان اثر می‌گذارد. نکته‌ی اصلی این است که شناسایی درآمد به زمان دریافت وجه نقد ربطی ندارد و بر ایفای تعهد در برابر مشتری استوار است. چارچوب مفهومی هم می‌گوید درآمد وقتی شناسایی می‌شود که قلم با تعریف درآمد (افزایش دارایی‌ها یا کاهش بدهی‌ها که به افزایش حقوق مالکانه می‌انجامد، به‌جز آورده مالکان) سازگار باشد و اطلاعات مربوط و بیان صادقانه فراهم کند (چارچوب مفهومی، بندهای ۴.۶۸، ۵.۶ و ۵.۷). پس برای تراکتور ۲۸ اسفند، پرسش اصلی «پول آمده یا نه؟» نیست، بلکه این است که شرکت بهار تعهد خود را ایفا کرده است یا نه.</w:t>
       </w:r>
     </w:p>
     <w:p>
@@ -18165,7 +18165,7 @@
                 <w:szCs w:val="20"/>
                 <w:rtl/>
               </w:rPr>
-              <w:t xml:space="preserve">آرمان‌کشت یک تراکتور و خدمات نگهداری یک‌ساله آن را با هم به مبلغ ۹۰۰ میلیون ریال می‌فروشد. اگر تراکتور به‌تنهایی ۸۵۰ میلیون و خدمات نگهداری به‌تنهایی ۱۵۰ میلیون ریال فروخته می‌شد (جمع ۱۰۰۰ میلیون)، تخصیص چنین است: تراکتور = ۹۰۰ × (۸۵۰ ÷ ۱۰۰۰) = </w:t>
+              <w:t xml:space="preserve">شرکت بهار یک تراکتور و خدمات نگهداری یک‌ساله آن را با هم به مبلغ ۹۰۰ میلیون ریال می‌فروشد. اگر تراکتور به‌تنهایی ۸۵۰ میلیون و خدمات نگهداری به‌تنهایی ۱۵۰ میلیون ریال فروخته می‌شد (جمع ۱۰۰۰ میلیون)، تخصیص چنین است: تراکتور = ۹۰۰ × (۸۵۰ ÷ ۱۰۰۰) = </w:t>
             </w:r>
             <w:r>
               <w:rPr>
@@ -19070,7 +19070,7 @@
                 <w:szCs w:val="20"/>
                 <w:rtl/>
               </w:rPr>
-              <w:t xml:space="preserve">اگر آرمان‌کشت از یک مشتری ۵۰ میلیارد ریال مطالبه داشته باشد و به همان طرف ۳۰ میلیارد ریال بدهکار باشد، نمی‌تواند در صورت وضعیت مالی فقط یک دارایی خالص ۲۰ میلیارد ریالی نشان دهد؛ زیرا دارایی و بدهی، به‌عنوان واحدهای حساب جداگانه، با تهاتر در یک مبلغ خالص ادغام می‌شوند و اطلاعات مربوط هر دو پنهان می‌ماند. (چارچوب مفهومی، بندهای ۷.۱۰ و ۷.۱۱)</w:t>
+              <w:t xml:space="preserve">اگر شرکت بهار از یک مشتری ۵۰ میلیارد ریال مطالبه داشته باشد و به همان طرف ۳۰ میلیارد ریال بدهکار باشد، نمی‌تواند در صورت وضعیت مالی فقط یک دارایی خالص ۲۰ میلیارد ریالی نشان دهد؛ زیرا دارایی و بدهی، به‌عنوان واحدهای حساب جداگانه، با تهاتر در یک مبلغ خالص ادغام می‌شوند و اطلاعات مربوط هر دو پنهان می‌ماند. (چارچوب مفهومی، بندهای ۷.۱۰ و ۷.۱۱)</w:t>
             </w:r>
           </w:p>
         </w:tc>
@@ -19869,7 +19869,7 @@
                 <w:szCs w:val="20"/>
                 <w:rtl/>
               </w:rPr>
-              <w:t xml:space="preserve">فرض کنید حقوق مالکانه‌ی ابتدای سال آرمان‌کشت ۱۰۰۰ میلیارد ریال و در پایان سال ۱۱۰۰ میلیارد ریال است (بدون آورده یا توزیع) و تورم سال ۲۰ درصد بوده است. در </w:t>
+              <w:t xml:space="preserve">فرض کنید حقوق مالکانه‌ی ابتدای سال شرکت بهار ۱۰۰۰ میلیارد ریال و در پایان سال ۱۱۰۰ میلیارد ریال است (بدون آورده یا توزیع) و تورم سال ۲۰ درصد بوده است. در </w:t>
             </w:r>
             <w:r>
               <w:rPr>
@@ -20506,7 +20506,7 @@
           <w:szCs w:val="22"/>
           <w:rtl/>
         </w:rPr>
-        <w:t xml:space="preserve">تا اینجا اصول را دیدیم؛ وقت آن است که آن‌ها را در موقعیت‌های واقعی به کار ببندیم. شما مشاور مالی شرکت «آرمان‌کشت» هستید و پیش از بستن حساب‌ها (۲۹ اسفند ۱۴۰۵) شش تصمیم مدیریت را بررسی می‌کنید. هر مورد را خودتان تحلیل کنید و بعد پاسخ را بخوانید.</w:t>
+        <w:t xml:space="preserve">تا اینجا اصول را دیدیم؛ وقت آن است که آن‌ها را در موقعیت‌های واقعی به کار ببندیم. شما مشاور مالی شرکت بهار هستید و پیش از بستن حساب‌ها (۲۹ اسفند ۱۴۰۵) شش تصمیم مدیریت را بررسی می‌کنید. هر مورد را خودتان تحلیل کنید و بعد پاسخ را بخوانید.</w:t>
       </w:r>
     </w:p>
     <w:p>
@@ -28433,7 +28433,7 @@
           <w:szCs w:val="22"/>
           <w:rtl/>
         </w:rPr>
-        <w:t xml:space="preserve">۱) مدیرعامل آرمان‌کشت می‌گوید: «ما به استانداردها عمل می‌کنیم؛ چارچوب مفهومی چه نیازی دارد؟» با تکیه بر سه کارکرد چارچوب و تجربه تاریخی کمیته رویه‌های حسابداری و هیئت اصول حسابداری پاسخ دهید. در چه موقعیتی چارچوب مستقیماً به حسابدار آرمان‌کشت کمک می‌کند؟</w:t>
+        <w:t xml:space="preserve">۱) مدیرعامل شرکت پارس‌گستر می‌گوید: «ما به استانداردها عمل می‌کنیم؛ چارچوب مفهومی چه نیازی دارد؟» با تکیه بر سه کارکرد چارچوب و تجربه تاریخی کمیته رویه‌های حسابداری و هیئت اصول حسابداری پاسخ دهید. در چه موقعیتی چارچوب مستقیماً به حسابدار شرکت پارس‌گستر کمک می‌کند؟</w:t>
       </w:r>
     </w:p>
     <w:p>
@@ -28450,7 +28450,7 @@
           <w:szCs w:val="22"/>
           <w:rtl/>
         </w:rPr>
-        <w:t xml:space="preserve">۲) یکی از سهامداران عمده آرمان‌کشت می‌خواهد گزارش مالی ویژه‌ای فقط برای خودش تهیه شود؛ مدیر مالی می‌گوید گزارش عمومی کافی است. چه کسی درست می‌گوید؟ مخاطبان اصلی گزارش مالی با مقاصد عمومی و حدود آن را با دو ارزیابی «چشم‌انداز جریان نقدی» و «مباشرت» توضیح دهید.</w:t>
+        <w:t xml:space="preserve">۲) یکی از سهامداران عمده شرکت بهین‌پوش می‌خواهد گزارش مالی ویژه‌ای فقط برای خودش تهیه شود؛ مدیر مالی می‌گوید گزارش عمومی کافی است. چه کسی درست می‌گوید؟ مخاطبان اصلی گزارش مالی با مقاصد عمومی و حدود آن را با دو ارزیابی «چشم‌انداز جریان نقدی» و «مباشرت» توضیح دهید.</w:t>
       </w:r>
     </w:p>
     <w:p>
@@ -28569,7 +28569,7 @@
           <w:szCs w:val="22"/>
           <w:rtl/>
         </w:rPr>
-        <w:t xml:space="preserve">۹) آرمان‌کشت ماشینی را همراه ۲ سال خدمات نگهداری به مبلغ ۱۲۰۰ میلیون ریال می‌فروشد. قیمت مستقل ماشین ۱۰۰۰ و خدمات ۲ ساله ۵۰۰ میلیون ریال است. ماشین در ابتدای سال تحویل می‌شود. پنج مرحله مدل شناسایی درآمد را برای این قرارداد پیش ببرید و درآمد سال اول را حساب کنید.</w:t>
+        <w:t xml:space="preserve">۹) شرکت شمیم‌گستر ماشینی را همراه ۲ سال خدمات نگهداری به مبلغ ۱۲۰۰ میلیون ریال می‌فروشد. قیمت مستقل ماشین ۱۰۰۰ و خدمات ۲ ساله ۵۰۰ میلیون ریال است. ماشین در ابتدای سال تحویل می‌شود. پنج مرحله مدل شناسایی درآمد را برای این قرارداد پیش ببرید و درآمد سال اول را حساب کنید.</w:t>
       </w:r>
     </w:p>
     <w:p>
@@ -28671,7 +28671,7 @@
           <w:szCs w:val="22"/>
           <w:rtl/>
         </w:rPr>
-        <w:t xml:space="preserve">۱۵) هدف قطع شناخت در چارچوب چیست؟ با مثال فروش ۷۵ درصد از مطالبات ۴۰۰ میلیارد ریالی آرمان‌کشت، به‌ویژه با توجه به تغییر واحد حساب، توضیح دهید چه بخشی از قلم حذف می‌شود و چه بخشی می‌ماند.</w:t>
+        <w:t xml:space="preserve">۱۵) هدف قطع شناخت در چارچوب چیست؟ با مثال فروش ۷۵ درصد از مطالبات ۴۰۰ میلیارد ریالی شرکت البرز‌پلیمر، به‌ویژه با توجه به تغییر واحد حساب، توضیح دهید چه بخشی از قلم حذف می‌شود و چه بخشی می‌ماند.</w:t>
       </w:r>
     </w:p>
     <w:p>
@@ -28797,7 +28797,7 @@
           <w:szCs w:val="22"/>
           <w:rtl/>
         </w:rPr>
-        <w:t xml:space="preserve">۱. صورت‌های مالی با مقاصد عمومی آرمان‌کشت در درجه اول برای چه کسانی تهیه می‌شود؟</w:t>
+        <w:t xml:space="preserve">۱. صورت‌های مالی با مقاصد عمومی شرکت آتیه‌سازان در درجه اول برای چه کسانی تهیه می‌شود؟</w:t>
       </w:r>
     </w:p>
     <w:p>
@@ -29171,7 +29171,7 @@
           <w:szCs w:val="22"/>
           <w:rtl/>
         </w:rPr>
-        <w:t xml:space="preserve">۵. آرمان‌کشت ذخیره تعویض قطعات را ۲۰۰ میلیون ریال برآورد کرده و روش و فرض‌ها را در یادداشت‌ها توضیح داده است. هزینه واقعی ۲۴۰ میلیون شد. درباره «عاری از اشتباه بودن» چه می‌گوییم؟</w:t>
+        <w:t xml:space="preserve">۵. شرکت دریای‌سبز ذخیره تعویض قطعات را ۲۰۰ میلیون ریال برآورد کرده و روش و فرض‌ها را در یادداشت‌ها توضیح داده است. هزینه واقعی ۲۴۰ میلیون شد. درباره «عاری از اشتباه بودن» چه می‌گوییم؟</w:t>
       </w:r>
     </w:p>
     <w:p>
@@ -29256,7 +29256,7 @@
           <w:szCs w:val="22"/>
           <w:rtl/>
         </w:rPr>
-        <w:t xml:space="preserve">۶. آرمان‌کشت یک خط تولید را با «اجاره به شرط تملیک» گرفته است؛ سند به نام شرکت نیست ولی کنترل منافع و تعهد پرداخت بلندمدت با اوست. کدام ثبت مطابق چارچوب است؟</w:t>
+        <w:t xml:space="preserve">۶. شرکت شیرین‌عسل یک خط تولید را با «اجاره به شرط تملیک» گرفته است؛ سند به نام شرکت نیست ولی کنترل منافع و تعهد پرداخت بلندمدت با اوست. کدام ثبت مطابق چارچوب است؟</w:t>
       </w:r>
     </w:p>
     <w:p>
@@ -29341,7 +29341,7 @@
           <w:szCs w:val="22"/>
           <w:rtl/>
         </w:rPr>
-        <w:t xml:space="preserve">۷. آرمان‌کشت روش ارزش‌گذاری موجودی را برای هم‌رنگ شدن با شرکت پیشرو صنعت تغییر می‌دهد. کدام ارزیابی درست‌تر است؟</w:t>
+        <w:t xml:space="preserve">۷. شرکت نیلوفر‌صنعت روش ارزش‌گذاری موجودی را برای هم‌رنگ شدن با شرکت پیشرو صنعت تغییر می‌دهد. کدام ارزیابی درست‌تر است؟</w:t>
       </w:r>
     </w:p>
     <w:p>
@@ -29596,7 +29596,7 @@
           <w:szCs w:val="22"/>
           <w:rtl/>
         </w:rPr>
-        <w:t xml:space="preserve">۱۰. کدام مورد، مطابق تعریف، دارایی آرمان‌کشت نیست؟</w:t>
+        <w:t xml:space="preserve">۱۰. کدام مورد، مطابق تعریف، دارایی شرکت هیرکان‌چوب نیست؟</w:t>
       </w:r>
     </w:p>
     <w:p>
@@ -29681,7 +29681,7 @@
           <w:szCs w:val="22"/>
           <w:rtl/>
         </w:rPr>
-        <w:t xml:space="preserve">۱۱. آرمان‌کشت اعلام عمومی می‌کند قطعه معیوب را رایگان تعویض خواهد کرد؛ قانون هیچ الزامی ندارد. کدام جمله درست است؟</w:t>
+        <w:t xml:space="preserve">۱۱. شرکت اروند‌گستر اعلام عمومی می‌کند قطعه معیوب را رایگان تعویض خواهد کرد؛ قانون هیچ الزامی ندارد. کدام جمله درست است؟</w:t>
       </w:r>
     </w:p>
     <w:p>
@@ -29766,7 +29766,7 @@
           <w:szCs w:val="22"/>
           <w:rtl/>
         </w:rPr>
-        <w:t xml:space="preserve">۱۲. آقای مالک، ۱۰۰ درصد سهام آرمان‌کشت را دارد و یک تراکتور از شرکت می‌خرد و بهای آن را می‌پردازد. این معامله برای شرکت چیست؟</w:t>
+        <w:t xml:space="preserve">۱۲. آقای مالک، ۱۰۰ درصد سهام شرکت پیام‌پاک را دارد و یک تراکتور از شرکت می‌خرد و بهای آن را می‌پردازد. این معامله برای شرکت چیست؟</w:t>
       </w:r>
     </w:p>
     <w:p>
@@ -30021,7 +30021,7 @@
           <w:szCs w:val="22"/>
           <w:rtl/>
         </w:rPr>
-        <w:t xml:space="preserve">۱۵. آرمان‌کشت مطالبات خود را به بانک می‌فروشد، اما کنترل آن را حفظ کرده و همچنان در معرض نوسانات عمده منافع آن است. وضعیت مطالبات چیست؟</w:t>
+        <w:t xml:space="preserve">۱۵. شرکت رادمان‌کابل مطالبات خود را به بانک می‌فروشد، اما کنترل آن را حفظ کرده و همچنان در معرض نوسانات عمده منافع آن است. وضعیت مطالبات چیست؟</w:t>
       </w:r>
     </w:p>
     <w:p>
@@ -30106,7 +30106,7 @@
           <w:szCs w:val="22"/>
           <w:rtl/>
         </w:rPr>
-        <w:t xml:space="preserve">۱۶. آرمان‌کشت می‌خواهد بداند اگر انبار را امروز در یک معامله نظام‌مند بفروشد چه مبلغی دریافت می‌کند. کدام مبنا به این پرسش پاسخ می‌دهد؟</w:t>
+        <w:t xml:space="preserve">۱۶. شرکت صدف‌گستر می‌خواهد بداند اگر انبار را امروز در یک معامله نظام‌مند بفروشد چه مبلغی دریافت می‌کند. کدام مبنا به این پرسش پاسخ می‌دهد؟</w:t>
       </w:r>
     </w:p>
     <w:p>
@@ -30361,7 +30361,7 @@
           <w:szCs w:val="22"/>
           <w:rtl/>
         </w:rPr>
-        <w:t xml:space="preserve">۱۹. آرمان‌کشت از فروش یک دارایی ۳۰ میلیارد ریال سود و از فروش دارایی دیگر ۳۲ میلیارد ریال زیان دارد و فقط «زیان خالص ۲ میلیارد» نشان می‌دهد. مشکل چیست؟</w:t>
+        <w:t xml:space="preserve">۱۹. شرکت بنیان‌سازه از فروش یک دارایی ۳۰ میلیارد ریال سود و از فروش دارایی دیگر ۳۲ میلیارد ریال زیان دارد و فقط «زیان خالص ۲ میلیارد» نشان می‌دهد. مشکل چیست؟</w:t>
       </w:r>
     </w:p>
     <w:p>
@@ -30531,7 +30531,7 @@
           <w:szCs w:val="22"/>
           <w:rtl/>
         </w:rPr>
-        <w:t xml:space="preserve">۲۱. آرمان‌کشت حقی در اختیار دارد که احتمال تولید منفعت اقتصادی از آن بسیار کم است. بر پایه چارچوب مفهومی کدام درست است؟</w:t>
+        <w:t xml:space="preserve">۲۱. شرکت مروارید‌سرام حقی در اختیار دارد که احتمال تولید منفعت اقتصادی از آن بسیار کم است. بر پایه چارچوب مفهومی کدام درست است؟</w:t>
       </w:r>
     </w:p>
     <w:p>
@@ -30616,7 +30616,7 @@
           <w:szCs w:val="22"/>
           <w:rtl/>
         </w:rPr>
-        <w:t xml:space="preserve">۲۲. آرمان‌کشت سال‌هاست بدون الزام قراردادی هزینه تعمیر قطعات معیوب را می‌پردازد و این سیاست را علناً اعلام کرده است. کدام ارزیابی درست است؟</w:t>
+        <w:t xml:space="preserve">۲۲. شرکت ایمن‌پمپ سال‌هاست بدون الزام قراردادی هزینه تعمیر قطعات معیوب را می‌پردازد و این سیاست را علناً اعلام کرده است. کدام ارزیابی درست است؟</w:t>
       </w:r>
     </w:p>
     <w:p>
@@ -30701,7 +30701,7 @@
           <w:szCs w:val="22"/>
           <w:rtl/>
         </w:rPr>
-        <w:t xml:space="preserve">۲۳. هیئت‌مدیره آرمان‌کشت در ۲۵ اسفند تصمیم گرفته است سال آینده ماشین‌آلات جدیدی بخرد. در ۲۹ اسفند شرکت بدهی‌ای بابت این خرید دارد؟</w:t>
+        <w:t xml:space="preserve">۲۳. هیئت‌مدیره شرکت دقیق‌ابزار در ۲۵ اسفند تصمیم گرفته است سال آینده ماشین‌آلات جدیدی بخرد. در ۲۹ اسفند شرکت بدهی‌ای بابت این خرید دارد؟</w:t>
       </w:r>
     </w:p>
     <w:p>
@@ -30871,7 +30871,7 @@
           <w:szCs w:val="22"/>
           <w:rtl/>
         </w:rPr>
-        <w:t xml:space="preserve">۲۵. آرمان‌کشت قراردادی برای خرید ۱۰۰۰ تن فولاد بسته است که هیچ‌یک از دو طرف هنوز تعهدی ایفا نکرده است. کدام درست است؟</w:t>
+        <w:t xml:space="preserve">۲۵. شرکت هما‌صنعت قراردادی برای خرید ۱۰۰۰ تن فولاد بسته است که هیچ‌یک از دو طرف هنوز تعهدی ایفا نکرده است. کدام درست است؟</w:t>
       </w:r>
     </w:p>
     <w:p>
@@ -31126,7 +31126,7 @@
           <w:szCs w:val="22"/>
           <w:rtl/>
         </w:rPr>
-        <w:t xml:space="preserve">۲۸. آرمان‌کشت یک دارایی شناسایی‌شده را از صورت وضعیت مالی خود حذف می‌کند. در چه حالتی قطع شناخت یک دارایی معمولاً رخ می‌دهد؟</w:t>
+        <w:t xml:space="preserve">۲۸. شرکت سپهر‌انرژی یک دارایی شناسایی‌شده را از صورت وضعیت مالی خود حذف می‌کند. در چه حالتی قطع شناخت یک دارایی معمولاً رخ می‌دهد؟</w:t>
       </w:r>
     </w:p>
     <w:p>
@@ -33131,7 +33131,7 @@
           <w:szCs w:val="22"/>
           <w:rtl/>
         </w:rPr>
-        <w:t xml:space="preserve">۴. آرمان‌کشت دو سال پیش دستگاهی را به ۶۰۰ میلیون ریال خریده (عمر مفید ۶ سال، خط مستقیم، بدون ارزش اسقاط). بهای دستگاه نو معادل امروز ۹۰۰ میلیون ریال و قیمت بازار دستگاه مشابه دوساله ۵۵۰ میلیون ریال است. (الف) مبلغ بر مبنای بهای تمام‌شده تاریخی؛ (ب) بهای جاری؛ (پ) ارزش منصفانه را حساب کنید. اگر شرکت قصد فروش دستگاه را داشته باشد، کدام مبنا مربوط‌تر است؟</w:t>
+        <w:t xml:space="preserve">۴. شرکت شقایق‌بسته دو سال پیش دستگاهی را به ۶۰۰ میلیون ریال خریده (عمر مفید ۶ سال، خط مستقیم، بدون ارزش اسقاط). بهای دستگاه نو معادل امروز ۹۰۰ میلیون ریال و قیمت بازار دستگاه مشابه دوساله ۵۵۰ میلیون ریال است. (الف) مبلغ بر مبنای بهای تمام‌شده تاریخی؛ (ب) بهای جاری؛ (پ) ارزش منصفانه را حساب کنید. اگر شرکت قصد فروش دستگاه را داشته باشد، کدام مبنا مربوط‌تر است؟</w:t>
       </w:r>
     </w:p>
     <w:p>
@@ -33148,7 +33148,7 @@
           <w:szCs w:val="22"/>
           <w:rtl/>
         </w:rPr>
-        <w:t xml:space="preserve">۵. آرمان‌کشت گوشی همراه (قیمت مستقل ۲۴۰ میلیون ریال) و ۱۲ ماه خدمات اینترنت (قیمت مستقل ۱۶۰ میلیون ریال) را در یک قرارداد به مبلغ ۳۲۰ میلیون ریال نقداً در ۱ مهر می‌فروشد. (الف) تعهدات عملکرد کدام‌اند؟ (ب) قیمت را تخصیص دهید. (پ) درآمد تا ۲۹ اسفند همان سال (۶ ماه خدمات) و مانده بدهی قراردادی را حساب کنید.</w:t>
+        <w:t xml:space="preserve">۵. شرکت مهر‌کالا گوشی همراه (قیمت مستقل ۲۴۰ میلیون ریال) و ۱۲ ماه خدمات اینترنت (قیمت مستقل ۱۶۰ میلیون ریال) را در یک قرارداد به مبلغ ۳۲۰ میلیون ریال نقداً در ۱ مهر می‌فروشد. (الف) تعهدات عملکرد کدام‌اند؟ (ب) قیمت را تخصیص دهید. (پ) درآمد تا ۲۹ اسفند همان سال (۶ ماه خدمات) و مانده بدهی قراردادی را حساب کنید.</w:t>
       </w:r>
     </w:p>
     <w:p>
@@ -33434,7 +33434,7 @@
           <w:szCs w:val="22"/>
           <w:rtl/>
         </w:rPr>
-        <w:t xml:space="preserve">۹. در پایان سال ۱۴۰۵ وضعیت‌های زیر درباره آرمان‌کشت وجود دارد. هر مورد را به یکی از گروه‌های «دارایی»، «بدهی» یا «هیچ‌کدام» نسبت دهید و با استناد به بندهای چارچوب دلیل بیاورید:</w:t>
+        <w:t xml:space="preserve">۹. در پایان سال ۱۴۰۵ وضعیت‌های زیر درباره شرکت دماوند‌یخچال وجود دارد. هر مورد را به یکی از گروه‌های «دارایی»، «بدهی» یا «هیچ‌کدام» نسبت دهید و با استناد به بندهای چارچوب دلیل بیاورید:</w:t>
       </w:r>
     </w:p>
     <w:p>
@@ -33536,7 +33536,7 @@
           <w:szCs w:val="22"/>
           <w:rtl/>
         </w:rPr>
-        <w:t xml:space="preserve">۱۰. آرمان‌کشت ماشینی را سه سال پیش به ۱۲۰۰ میلیون ریال خریده است (عمر مفید ۸ سال، خط مستقیم، بدون ارزش اسقاط). امروز قیمت ماشین نو همسان ۱۵۰۰ میلیون ریال، قیمت فروش همین ماشین در بازار ۷۰۰ میلیون ریال با ۵۰ میلیون ریال مخارج واگذاری، و ارزش فعلی جریان‌های نقدی از بکارگیری آن (شامل ارزش فعلی مخارج واگذاری نهایی) ۷۸۰ میلیون ریال برآورد شده است. بهای تاریخی (مبلغ دفتری)، بهای جاری (تعدیل‌شده برای عمر)، ارزش منصفانه و ارزش بکارگیری را تعیین کنید و بگویید برای تصمیم فروش کدام اطلاعات مربوط‌تر است.</w:t>
+        <w:t xml:space="preserve">۱۰. شرکت برتر‌کنترل ماشینی را سه سال پیش به ۱۲۰۰ میلیون ریال خریده است (عمر مفید ۸ سال، خط مستقیم، بدون ارزش اسقاط). امروز قیمت ماشین نو همسان ۱۵۰۰ میلیون ریال، قیمت فروش همین ماشین در بازار ۷۰۰ میلیون ریال با ۵۰ میلیون ریال مخارج واگذاری، و ارزش فعلی جریان‌های نقدی از بکارگیری آن (شامل ارزش فعلی مخارج واگذاری نهایی) ۷۸۰ میلیون ریال برآورد شده است. بهای تاریخی (مبلغ دفتری)، بهای جاری (تعدیل‌شده برای عمر)، ارزش منصفانه و ارزش بکارگیری را تعیین کنید و بگویید برای تصمیم فروش کدام اطلاعات مربوط‌تر است.</w:t>
       </w:r>
     </w:p>
     <w:p>
@@ -33553,7 +33553,7 @@
           <w:szCs w:val="22"/>
           <w:rtl/>
         </w:rPr>
-        <w:t xml:space="preserve">۱۱. حقوق مالکانه آرمان‌کشت در ابتدای سال ۸۰۰ و در پایان سال ۱۰۰۰ میلیارد ریال است (بدون آورده و توزیع). تورم عمومی ۲۰ درصد و افزایش بهای جاری دارایی‌های عملیاتی ۳۰ درصد بوده است. سود دوره را (الف) بر مبنای نگهداشت سرمایه مالی اسمی، (ب) بر مبنای نگهداشت قدرت خرید و (پ) بر مبنای نگهداشت سرمایه فیزیکی محاسبه کنید.</w:t>
+        <w:t xml:space="preserve">۱۱. حقوق مالکانه شرکت ثمین‌پوشش در ابتدای سال ۸۰۰ و در پایان سال ۱۰۰۰ میلیارد ریال است (بدون آورده و توزیع). تورم عمومی ۲۰ درصد و افزایش بهای جاری دارایی‌های عملیاتی ۳۰ درصد بوده است. سود دوره را (الف) بر مبنای نگهداشت سرمایه مالی اسمی، (ب) بر مبنای نگهداشت قدرت خرید و (پ) بر مبنای نگهداشت سرمایه فیزیکی محاسبه کنید.</w:t>
       </w:r>
     </w:p>
     <w:p>
@@ -33587,7 +33587,7 @@
           <w:szCs w:val="22"/>
           <w:rtl/>
         </w:rPr>
-        <w:t xml:space="preserve">۱۳. آرمان‌کشت ۱۰۰ درصد شرکت الف و ۶۰ درصد شرکت ب را کنترل می‌کند و در شرکت ج نفوذ قابل ملاحظه (بدون کنترل) دارد. مالک مشترک آرمان‌کشت دو شرکت د و ه را نیز دارد که هیچ‌یک دیگری را کنترل نمی‌کند. (الف) صورت‌های مالی تلفیقی گروه چه شرکت‌هایی را در بر می‌گیرد؟ (ب) صورت‌های مالی فقط خود آرمان‌کشت چه نام دارد؟ (پ) اگر مالک بخواهد آرمان‌کشت، د و ه را یک مجموعه گزارش کند، نام صورت‌های مالی چیست و چه توصیفی باید ارائه شود؟</w:t>
+        <w:t xml:space="preserve">۱۳. شرکت آرین‌ریخته ۱۰۰ درصد شرکت الف و ۶۰ درصد شرکت ب را کنترل می‌کند و در شرکت ج نفوذ قابل ملاحظه (بدون کنترل) دارد. مالک مشترک شرکت آرین‌ریخته دو شرکت د و ه را نیز دارد که هیچ‌یک دیگری را کنترل نمی‌کند. (الف) صورت‌های مالی تلفیقی گروه چه شرکت‌هایی را در بر می‌گیرد؟ (ب) صورت‌های مالی فقط خود شرکت آرین‌ریخته چه نام دارد؟ (پ) اگر مالک بخواهد شرکت آرین‌ریخته، د و ه را یک مجموعه گزارش کند، نام صورت‌های مالی چیست و چه توصیفی باید ارائه شود؟</w:t>
       </w:r>
     </w:p>
     <w:p>
@@ -33604,7 +33604,7 @@
           <w:szCs w:val="22"/>
           <w:rtl/>
         </w:rPr>
-        <w:t xml:space="preserve">۱۴. آرمان‌کشت از یک تأمین‌کننده ۵۰ میلیارد ریال مطالبه و به همان تأمین‌کننده ۳۰ میلیارد ریال بدهی دارد و هیچ استانداردی تهاتر آنها را مجاز یا الزامی نکرده است. اقلام را چگونه ارائه می‌کنید و بر پایه چه بندی؟</w:t>
+        <w:t xml:space="preserve">۱۴. شرکت سالار‌ترانس از یک تأمین‌کننده ۵۰ میلیارد ریال مطالبه و به همان تأمین‌کننده ۳۰ میلیارد ریال بدهی دارد و هیچ استانداردی تهاتر آنها را مجاز یا الزامی نکرده است. اقلام را چگونه ارائه می‌کنید و بر پایه چه بندی؟</w:t>
       </w:r>
     </w:p>
     <w:p>
@@ -33621,7 +33621,7 @@
           <w:szCs w:val="22"/>
           <w:rtl/>
         </w:rPr>
-        <w:t xml:space="preserve">۱۵. آرمان‌کشت مطالبه‌ای ۴۰۰ میلیارد ریالی دارد. ۷۵ درصد آن را بدون حق مراجعه و بدون حفظ کنترل منتقل می‌کند. (الف) چه بخشی قطع شناخت می‌شود؟ (ب) واحد حساب چه تغییری می‌کند؟ (پ) مبلغ قلم باقی‌مانده چقدر است؟</w:t>
+        <w:t xml:space="preserve">۱۵. شرکت توسن‌ماشین مطالبه‌ای ۴۰۰ میلیارد ریالی دارد. ۷۵ درصد آن را بدون حق مراجعه و بدون حفظ کنترل منتقل می‌کند. (الف) چه بخشی قطع شناخت می‌شود؟ (ب) واحد حساب چه تغییری می‌کند؟ (پ) مبلغ قلم باقی‌مانده چقدر است؟</w:t>
       </w:r>
     </w:p>
     <w:p>
@@ -35170,7 +35170,7 @@
                 <w:szCs w:val="19"/>
                 <w:rtl/>
               </w:rPr>
-              <w:t xml:space="preserve">الف) نادرست (یعنی دارایی است). حق است، قابلیت تولید منافع دارد و آرمان‌کشت آن را کنترل می‌کند.</w:t>
+              <w:t xml:space="preserve">الف) نادرست (یعنی دارایی است). حق است، قابلیت تولید منافع دارد و شرکت هیرکان‌چوب آن را کنترل می‌کند.</w:t>
             </w:r>
           </w:p>
           <w:p>
@@ -40729,7 +40729,7 @@
           <w:szCs w:val="22"/>
           <w:rtl/>
         </w:rPr>
-        <w:t xml:space="preserve"> آرمان‌کشت، الف و ب (به‌صورت تلفیقی؛ سهم ۴۰ درصد سایر سهامداران ب به‌صورت منافع فاقد کنترل نشان داده می‌شود)؛ ج به دلیل نبود کنترل تلفیق نمی‌شود. </w:t>
+        <w:t xml:space="preserve"> شرکت آرین‌ریخته، الف و ب (به‌صورت تلفیقی؛ سهم ۴۰ درصد سایر سهامداران ب به‌صورت منافع فاقد کنترل نشان داده می‌شود)؛ ج به دلیل نبود کنترل تلفیق نمی‌شود. </w:t>
       </w:r>
       <w:r>
         <w:rPr>
@@ -42094,7 +42094,7 @@
           <w:szCs w:val="27"/>
           <w:rtl/>
         </w:rPr>
-        <w:t xml:space="preserve">ب-۱ پایان سال آرمان‌کشت</w:t>
+        <w:t xml:space="preserve">ب-۱ پایان سال شرکت بهار</w:t>
       </w:r>
       <w:bookmarkEnd w:id="91"/>
     </w:p>
@@ -42156,7 +42156,7 @@
                 <w:szCs w:val="21"/>
                 <w:rtl/>
               </w:rPr>
-              <w:t xml:space="preserve">مثال: آرمان‌کشت، تولیدکننده تراکتور و ماشین‌آلات کشاورزی، در ۲۹ اسفند ۱۴۰۵</w:t>
+              <w:t xml:space="preserve">مثال: شرکت بهار، تولیدکننده تراکتور و ماشین‌آلات کشاورزی، در ۲۹ اسفند ۱۴۰۵</w:t>
             </w:r>
           </w:p>
           <w:p>
@@ -42172,7 +42172,7 @@
                 <w:szCs w:val="20"/>
                 <w:rtl/>
               </w:rPr>
-              <w:t xml:space="preserve">شرکت آرمان‌کشت، تولیدکننده تراکتور و ماشین‌آلات کشاورزی، حساب‌های سال ۱۴۰۵ را می‌بندد. مبالغ به میلیارد ریال است. رویدادهای زیر باید بررسی شوند:</w:t>
+              <w:t xml:space="preserve">شرکت بهار، تولیدکننده تراکتور و ماشین‌آلات کشاورزی، حساب‌های سال ۱۴۰۵ را می‌بندد. مبالغ به میلیارد ریال است. رویدادهای زیر باید بررسی شوند:</w:t>
             </w:r>
           </w:p>
           <w:p>

</xml_diff>

<commit_message>
Both chapters: relative years (x1, x2) in examples and problems; chapter 1 company is a shoe manufacturer, chapter 2 company is a food-products manufacturer
Co-Authored-By: Claude Sonnet 5.5 <noreply@anthropic.com>
Claude-Session: https://claude.ai/code/session_01BKYmyGRjeasSCqf91ZP9Rq
</commit_message>
<xml_diff>
--- a/ch1_conceptual_framework_updated.docx
+++ b/ch1_conceptual_framework_updated.docx
@@ -294,7 +294,7 @@
           <w:szCs w:val="22"/>
           <w:rtl/>
         </w:rPr>
-        <w:t xml:space="preserve">ساعت از نیمه‌شب ۲۹ اسفند گذشته است و حسابدار شرکت بهار، تولیدکننده تراکتور و ماشین‌آلات کشاورزی، هنوز پشت میزش نشسته است. روز ۲۸ اسفند تراکتوری به بهای ۱۰ میلیارد ریال به مشتری اعتباری تحویل داده شده و مشتری قول داده بهای آن را ۱۵ فروردین بپردازد. حسابدار ارشد معتقد است درآمد این فروش مال امسال است. همکار جوان‌ترش می‌گوید: «تا پول نیامده، درآمدی نداریم.» هر دو با اطمینان سخن می‌گویند و هر دو می‌توانند از نظر خود دفاع کنند. اما نتیجه‌ی این اختلاف ساده نیست: اگر درآمد امسال ثبت شود، سود شرکت ده میلیارد ریال بیشتر می‌شود و پاداش مدیران، ارزیابی بانک و قیمت سهام، همه تغییر می‌کنند. پس چه کسی حق دارد میان این دو قضاوت کند؟ به قاعده‌ای مشترک نیاز داریم و آن قاعده، موضوع این فصل است. در سراسر فصل همین شرکت فرضی همراه ما خواهد بود.</w:t>
+        <w:t xml:space="preserve">ساعت از نیمه‌شب ۲۹ اسفند گذشته است و حسابدار شرکت بهار، تولیدکننده کفش، هنوز پشت میزش نشسته است. روز ۲۸ اسفند محموله‌ای کفش به بهای ۱۰ میلیارد ریال به یک فروشگاه زنجیره‌ای، مشتری اعتباری شرکت، تحویل داده شده و مشتری قول داده بهای آن را ۱۵ فروردین بپردازد. حسابدار ارشد معتقد است درآمد این فروش مال امسال است. همکار جوان‌ترش می‌گوید: «تا پول نیامده، درآمدی نداریم.» هر دو با اطمینان سخن می‌گویند و هر دو می‌توانند از نظر خود دفاع کنند. اما نتیجه‌ی این اختلاف ساده نیست: اگر درآمد امسال ثبت شود، سود شرکت ده میلیارد ریال بیشتر می‌شود و پاداش مدیران، ارزیابی بانک و قیمت سهام، همه تغییر می‌کنند. پس چه کسی حق دارد میان این دو قضاوت کند؟ به قاعده‌ای مشترک نیاز داریم و آن قاعده، موضوع این فصل است. در سراسر فصل همین شرکت فرضی همراه ما خواهد بود.</w:t>
       </w:r>
     </w:p>
     <w:p>
@@ -6471,7 +6471,7 @@
                 <w:szCs w:val="20"/>
                 <w:rtl/>
               </w:rPr>
-              <w:t xml:space="preserve">به تراکتور شرکت بهار برگردیم. بر مبنای نقدی، امسال هیچ درآمدی ثبت نمی‌شود، که تصویر گمراه‌کننده‌ای است؛ زیرا شرکت کار خود را انجام داده و منبع اقتصادی تازه‌ای به نام مطالبات به دست آورده است. </w:t>
+              <w:t xml:space="preserve">به محموله کفش شرکت بهار برگردیم. بر مبنای نقدی، امسال هیچ درآمدی ثبت نمی‌شود، که تصویر گمراه‌کننده‌ای است؛ زیرا شرکت کار خود را انجام داده و منبع اقتصادی تازه‌ای به نام مطالبات به دست آورده است. </w:t>
             </w:r>
             <w:r>
               <w:rPr>
@@ -7990,7 +7990,7 @@
                 <w:szCs w:val="21"/>
                 <w:rtl/>
               </w:rPr>
-              <w:t xml:space="preserve">مثال: آچار و ذخیره</w:t>
+              <w:t xml:space="preserve">مثال: چکش کفاشی و ذخیره</w:t>
             </w:r>
           </w:p>
           <w:p>
@@ -8006,7 +8006,7 @@
                 <w:szCs w:val="20"/>
                 <w:rtl/>
               </w:rPr>
-              <w:t xml:space="preserve">خرید یک آچار ۵۰۰ هزار ریالی برای شرکت بهار بی‌اهمیت است و فوراً هزینه می‌شود، حتی اگر ده سال عمر کند؛ سرمایه‌ای کردن و استهلاک‌گیری آن هزینه‌ای بیش از ارزش اطلاعاتش دارد. اما فرض کنید شرکتی دیگر سه سال متوالی زیان‌ده بوده و امسال با کاهش ناچیز ذخیره مطالبات مشکوک‌الوصول، که فقط ۳ درصد سود را تغییر می‌دهد، «سودده» دیده شود. مبلغ کوچک است، اما چون روند و جهت سود را عوض می‌کند، بااهمیت است.</w:t>
+              <w:t xml:space="preserve">خرید یک چکش کفاشی ۵۰۰ هزار ریالی برای شرکت بهار بی‌اهمیت است و فوراً هزینه می‌شود، حتی اگر ده سال عمر کند؛ سرمایه‌ای کردن و استهلاک‌گیری آن هزینه‌ای بیش از ارزش اطلاعاتش دارد. اما فرض کنید شرکتی دیگر سه سال متوالی زیان‌ده بوده و امسال با کاهش ناچیز ذخیره مطالبات مشکوک‌الوصول، که فقط ۳ درصد سود را تغییر می‌دهد، «سودده» دیده شود. مبلغ کوچک است، اما چون روند و جهت سود را عوض می‌کند، بااهمیت است.</w:t>
             </w:r>
           </w:p>
         </w:tc>
@@ -8797,7 +8797,7 @@
           <w:szCs w:val="22"/>
           <w:rtl/>
         </w:rPr>
-        <w:t xml:space="preserve">چون این ارزیابی‌ها ذاتاً قضاوتی و دشوار است، افراد مختلف مخارج و منافع گزارشگری اقلام خاصی از اطلاعات را متفاوت می‌سنجند. از این‌رو کمیته می‌کوشد مخارج و منافع گزارشگری مالی را به‌طور عام در نظر بگیرد و نه فقط در ارتباط با یک واحد گزارشگر. این بدان معنا نیست که ارزیابی مخارج و منافع همیشه الزامات گزارشگری یکسانی را برای همه واحدهای تجاری توجیه می‌کند؛ اندازه متفاوت واحدها، روش‌های گوناگون افزایش سرمایه (سهامی عام یا غیر سهامی عام)، نیازهای متفاوت استفاده‌کنندگان و عوامل دیگر ممکن است چنین تفاوت‌هایی را مناسب کند (چارچوب مفهومی، بند ۲.۴۳). در سطح یک واحد، مفهوم اهمیت و محدودیت مخارج هر دو در تصمیم‌هایی از نوع خرید آچار ۵۰۰ هزار ریالی شرکت بهار دخیل‌اند، که مستقیماً هزینه می‌شود؛ اما این کاربرد مثال ماست و ارزیابی چارچوب در سطح گزارشگری مالی عام است، نه یک واحد.</w:t>
+        <w:t xml:space="preserve">چون این ارزیابی‌ها ذاتاً قضاوتی و دشوار است، افراد مختلف مخارج و منافع گزارشگری اقلام خاصی از اطلاعات را متفاوت می‌سنجند. از این‌رو کمیته می‌کوشد مخارج و منافع گزارشگری مالی را به‌طور عام در نظر بگیرد و نه فقط در ارتباط با یک واحد گزارشگر. این بدان معنا نیست که ارزیابی مخارج و منافع همیشه الزامات گزارشگری یکسانی را برای همه واحدهای تجاری توجیه می‌کند؛ اندازه متفاوت واحدها، روش‌های گوناگون افزایش سرمایه (سهامی عام یا غیر سهامی عام)، نیازهای متفاوت استفاده‌کنندگان و عوامل دیگر ممکن است چنین تفاوت‌هایی را مناسب کند (چارچوب مفهومی، بند ۲.۴۳). در سطح یک واحد، مفهوم اهمیت و محدودیت مخارج هر دو در تصمیم‌هایی از نوع خرید چکش کفاشی ۵۰۰ هزار ریالی شرکت بهار دخیل‌اند، که مستقیماً هزینه می‌شود؛ اما این کاربرد مثال ماست و ارزیابی چارچوب در سطح گزارشگری مالی عام است، نه یک واحد.</w:t>
       </w:r>
     </w:p>
     <w:p>
@@ -10224,7 +10224,7 @@
           <w:szCs w:val="22"/>
           <w:rtl/>
         </w:rPr>
-        <w:t xml:space="preserve">در اصل هر حق، دارایی جداگانه است؛ اما برای مقاصد حسابداری، حقوق مرتبط اغلب به‌عنوان یک واحد حساب و یک دارایی منفرد به شمار می‌آید. مالکیت قانونی یک شیء فیزیکی ممکن است چند حق ایجاد کند: حق استفاده از آن، حق فروش حقوق آن، حق وثیقه گذاشتن حقوق آن، و حقوق دیگر (چارچوب مفهومی، بند ۴.۱۱). به لحاظ مفهومی، منبع اقتصادی مجموعه این حقوق است، نه خود شیء فیزیکی؛ با این حال وقتی می‌گوییم «ساختمان» یا «تراکتور»، مجموعه‌ای از حقوق را در قالب شیء توصیف می‌کنیم، که اغلب مختصرترین و قابل‌فهم‌ترین شیوه بیان صادقانه آن حقوق است (چارچوب مفهومی، بند ۴.۱۲). همین نکته است که تفاوت «مالکیت» و «کنترل» و جایگاه اجاره را در تعریف دارایی روشن می‌کند. سرانجام، گاهی اینکه حقی وجود دارد یا نه، خود نامطمئن است. اگر شرکت و طرف دیگر بر سر حق دریافت منبعی اختلاف داشته باشند، تا رفع این عدم اطمینان، مثلاً با حکم دادگاه، معلوم نیست حق و در نتیجه دارایی وجود دارد یا نه؛ نحوه برخورد با چنین دارایی‌هایی را در بخش شناخت خواهیم دید (چارچوب مفهومی، بندهای ۴.۱۳ و ۵.۱۴).</w:t>
+        <w:t xml:space="preserve">در اصل هر حق، دارایی جداگانه است؛ اما برای مقاصد حسابداری، حقوق مرتبط اغلب به‌عنوان یک واحد حساب و یک دارایی منفرد به شمار می‌آید. مالکیت قانونی یک شیء فیزیکی ممکن است چند حق ایجاد کند: حق استفاده از آن، حق فروش حقوق آن، حق وثیقه گذاشتن حقوق آن، و حقوق دیگر (چارچوب مفهومی، بند ۴.۱۱). به لحاظ مفهومی، منبع اقتصادی مجموعه این حقوق است، نه خود شیء فیزیکی؛ با این حال وقتی می‌گوییم «ساختمان» یا «دستگاه دوخت»، مجموعه‌ای از حقوق را در قالب شیء توصیف می‌کنیم، که اغلب مختصرترین و قابل‌فهم‌ترین شیوه بیان صادقانه آن حقوق است (چارچوب مفهومی، بند ۴.۱۲). همین نکته است که تفاوت «مالکیت» و «کنترل» و جایگاه اجاره را در تعریف دارایی روشن می‌کند. سرانجام، گاهی اینکه حقی وجود دارد یا نه، خود نامطمئن است. اگر شرکت و طرف دیگر بر سر حق دریافت منبعی اختلاف داشته باشند، تا رفع این عدم اطمینان، مثلاً با حکم دادگاه، معلوم نیست حق و در نتیجه دارایی وجود دارد یا نه؛ نحوه برخورد با چنین دارایی‌هایی را در بخش شناخت خواهیم دید (چارچوب مفهومی، بندهای ۴.۱۳ و ۵.۱۴).</w:t>
       </w:r>
     </w:p>
     <w:p>
@@ -10599,7 +10599,7 @@
                 <w:szCs w:val="20"/>
                 <w:rtl/>
               </w:rPr>
-              <w:t xml:space="preserve">شرکت بهار متوجه می‌شود یک قطعه در تراکتورهای فروخته‌شده نقص دارد. گارانتی تمام شده و هیچ قانونی شرکت را ملزم نمی‌کند، اما مدیرعامل در نشستی خبری اعلام می‌کند شرکت قطعه را رایگان تعویض می‌کند. با این اعلام عمومی، شرکت دیگر توانایی عملی اجتناب از این تعهد را ندارد: رویداد گذشته رخ داده، تعهد فعلی ایجاد شده و انتقال منبع اقتصادی لازم است. بدهی باید شناسایی شود، هرچند قانون الزامی نکرده است.</w:t>
+              <w:t xml:space="preserve">شرکت بهار متوجه می‌شود چسب به‌کاررفته در یک سری کفش فروخته‌شده نقص دارد و کفش‌ها زود از هم باز می‌شوند. گارانتی تمام شده و هیچ قانونی شرکت را ملزم نمی‌کند، اما مدیرعامل در نشستی خبری اعلام می‌کند شرکت کفش‌های معیوب را رایگان تعویض می‌کند. با این اعلام عمومی، شرکت دیگر توانایی عملی اجتناب از این تعهد را ندارد: رویداد گذشته رخ داده، تعهد فعلی ایجاد شده و انتقال منبع اقتصادی لازم است. بدهی باید شناسایی شود، هرچند قانون الزامی نکرده است.</w:t>
             </w:r>
           </w:p>
         </w:tc>
@@ -10846,7 +10846,7 @@
           <w:szCs w:val="22"/>
           <w:rtl/>
         </w:rPr>
-        <w:t xml:space="preserve">توجه کنید که درآمد و هزینه نیز بر پایه دارایی‌ها و بدهی‌ها تعریف شده‌اند. چارچوب برای هر یک تنها یک تعریف دارد؛ اما در عمل، درآمد هم شامل درآمد عملیاتی (مثل فروش تراکتور) و هم سایر درآمدها و سودها (مثل سود فروش یک دارایی ثابت) است و هزینه هم هزینه‌ها و زیان‌ها (مثل زیان آتش‌سوزی انبار) را در بر می‌گیرد. این طبقه‌بندی از استانداردها و مقررات می‌آید و بخشی از تعریف چارچوب نیست. آورده مالکان، مانند افزایش سرمایه، درآمد نیست و توزیع سود میان آن‌ها هم هزینه نیست (چارچوب مفهومی، بند ۴.۷۰)؛ این‌ها تغییراتی در حقوق مالکانه‌اند که در صورت تغییرات حقوق مالکانه می‌آیند. اما «نقش» مالک تعیین‌کننده است.</w:t>
+        <w:t xml:space="preserve">توجه کنید که درآمد و هزینه نیز بر پایه دارایی‌ها و بدهی‌ها تعریف شده‌اند. چارچوب برای هر یک تنها یک تعریف دارد؛ اما در عمل، درآمد هم شامل درآمد عملیاتی (مثل فروش کفش) و هم سایر درآمدها و سودها (مثل سود فروش یک دارایی ثابت) است و هزینه هم هزینه‌ها و زیان‌ها (مثل زیان آتش‌سوزی انبار) را در بر می‌گیرد. این طبقه‌بندی از استانداردها و مقررات می‌آید و بخشی از تعریف چارچوب نیست. آورده مالکان، مانند افزایش سرمایه، درآمد نیست و توزیع سود میان آن‌ها هم هزینه نیست (چارچوب مفهومی، بند ۴.۷۰)؛ این‌ها تغییراتی در حقوق مالکانه‌اند که در صورت تغییرات حقوق مالکانه می‌آیند. اما «نقش» مالک تعیین‌کننده است.</w:t>
       </w:r>
     </w:p>
     <w:tbl>
@@ -12884,7 +12884,7 @@
           <w:szCs w:val="22"/>
           <w:rtl/>
         </w:rPr>
-        <w:t xml:space="preserve">شاید بپرسید این فرض چه تفاوتی در عدد‌ها ایجاد می‌کند. پاسخ این است که بسیاری از رفتارهای معمول حسابداران روی همین فرض سوار است. اگر شرکت بهار قرار بود فردا تعطیل شود، ممکن بود لازم شود انبار و ماشین‌آلاتش را مثلاً به قیمت تصفیه، یعنی حراج فوری، گزارش کنیم؛ چارچوب فقط از «مبنای متفاوت» سخن می‌گوید و قیمت تصفیه نمونه‌ای مصداقی از این مبنا است، اما الزام توصیف مبنای به‌کاررفته در صورت‌های مالی (بند ۳.۹) در هر حال برقرار می‌ماند. اما چون فرض می‌کنیم شرکت می‌ماند و از آن دارایی‌ها برای تولید تراکتور استفاده می‌کند، قیمت فروش فوری آن‌ها اهمیتی ندارد و ثبت دارایی به بهای خرید معنا پیدا می‌کند. به همین ترتیب تفکیک دارایی‌ها به جاری و غیرجاری فقط وقتی معنا دارد که «بلندمدت» آینده‌ای داشته باشد، و وقتی بهای یک دستگاه را در ده سال مستهلک می‌کنیم، در واقع پیش‌بینی کرده‌ایم که شرکت ده سال دیگر هم هست تا از آن دستگاه بهره ببرد. این فرض البته مثل هر فرضی نقدپذیر است و برخی نظریه‌پردازان، از جمله چمبرز، آن را بیشتر یک پیش‌بینی می‌دانند تا یک واقعیت اثبات‌شده (این داوری از مؤلفان است و در چارچوب نیامده است)؛ در هر حال تا زمانی که قصد یا ضرورت انحلال یا توقف عملیات در میان نیست، حسابداری روی این فرض بنا می‌شود.</w:t>
+        <w:t xml:space="preserve">شاید بپرسید این فرض چه تفاوتی در عدد‌ها ایجاد می‌کند. پاسخ این است که بسیاری از رفتارهای معمول حسابداران روی همین فرض سوار است. اگر شرکت بهار قرار بود فردا تعطیل شود، ممکن بود لازم شود انبار و ماشین‌آلاتش را مثلاً به قیمت تصفیه، یعنی حراج فوری، گزارش کنیم؛ چارچوب فقط از «مبنای متفاوت» سخن می‌گوید و قیمت تصفیه نمونه‌ای مصداقی از این مبنا است، اما الزام توصیف مبنای به‌کاررفته در صورت‌های مالی (بند ۳.۹) در هر حال برقرار می‌ماند. اما چون فرض می‌کنیم شرکت می‌ماند و از آن دارایی‌ها برای تولید کفش استفاده می‌کند، قیمت فروش فوری آن‌ها اهمیتی ندارد و ثبت دارایی به بهای خرید معنا پیدا می‌کند. به همین ترتیب تفکیک دارایی‌ها به جاری و غیرجاری فقط وقتی معنا دارد که «بلندمدت» آینده‌ای داشته باشد، و وقتی بهای یک دستگاه را در ده سال مستهلک می‌کنیم، در واقع پیش‌بینی کرده‌ایم که شرکت ده سال دیگر هم هست تا از آن دستگاه بهره ببرد. این فرض البته مثل هر فرضی نقدپذیر است و برخی نظریه‌پردازان، از جمله چمبرز، آن را بیشتر یک پیش‌بینی می‌دانند تا یک واقعیت اثبات‌شده (این داوری از مؤلفان است و در چارچوب نیامده است)؛ در هر حال تا زمانی که قصد یا ضرورت انحلال یا توقف عملیات در میان نیست، حسابداری روی این فرض بنا می‌شود.</w:t>
       </w:r>
     </w:p>
     <w:p>
@@ -13033,7 +13033,7 @@
           <w:szCs w:val="22"/>
           <w:rtl/>
         </w:rPr>
-        <w:t xml:space="preserve"> است. وقتی رشته‌ی عمر شرکت را می‌بریم، رویدادهایی پیدا می‌شوند که از مرز دو دوره رد می‌شوند، مانند همان تراکتور ۲۸ اسفند که پولش فروردین می‌آید، و باید تصمیم بگیریم به کدام دوره تعلق دارند. مفاهیم تحقق درآمد و تطابق هزینه با درآمد، که در بخش‌های بعد می‌شناسید، برای پاسخ به همین مسئله ساخته شده‌اند و می‌خواهند سود را در برش‌های زمانی درست حبس کنند، نه زودتر و نه دیرتر. چارچوب مفهومی هم در بخش عملکرد مالی تصریح می‌کند که تصویر بهتری از عملکرد دوره با حسابداری تعهدی به دست می‌آید تا صرفاً با دریافت‌ها و پرداخت‌های نقدی.</w:t>
+        <w:t xml:space="preserve"> است. وقتی رشته‌ی عمر شرکت را می‌بریم، رویدادهایی پیدا می‌شوند که از مرز دو دوره رد می‌شوند، مانند همان محموله کفش ۲۸ اسفند که پولش فروردین می‌آید، و باید تصمیم بگیریم به کدام دوره تعلق دارند. مفاهیم تحقق درآمد و تطابق هزینه با درآمد، که در بخش‌های بعد می‌شناسید، برای پاسخ به همین مسئله ساخته شده‌اند و می‌خواهند سود را در برش‌های زمانی درست حبس کنند، نه زودتر و نه دیرتر. چارچوب مفهومی هم در بخش عملکرد مالی تصریح می‌کند که تصویر بهتری از عملکرد دوره با حسابداری تعهدی به دست می‌آید تا صرفاً با دریافت‌ها و پرداخت‌های نقدی.</w:t>
       </w:r>
     </w:p>
     <w:p>
@@ -13231,7 +13231,7 @@
           <w:szCs w:val="22"/>
           <w:rtl/>
         </w:rPr>
-        <w:t xml:space="preserve"> در روایت سنتی می‌گوید معاملات و رویدادهای مالی با واحد پول رایج، مانند ریال یا دلار، اندازه‌گیری و گزارش می‌شوند. پول مخرج مشترکی است که اجازه می‌دهد اقلام ناهمگنی مثل زمین، تراکتور و میز اداری را با هم جمع بزنیم و بگوییم مجموع دارایی‌های شرکت بهار چقدر است. همین یکسان‌سازی قابل مقایسه بودن گزارش‌ها را بسیار بالا می‌برد. اما این فرض دو پاشنه‌ی آشیل هم دارد که منتقدان همیشه به آن حمله می‌کنند.</w:t>
+        <w:t xml:space="preserve"> در روایت سنتی می‌گوید معاملات و رویدادهای مالی با واحد پول رایج، مانند ریال یا دلار، اندازه‌گیری و گزارش می‌شوند. پول مخرج مشترکی است که اجازه می‌دهد اقلام ناهمگنی مثل زمین، دستگاه دوخت و میز اداری را با هم جمع بزنیم و بگوییم مجموع دارایی‌های شرکت بهار چقدر است. همین یکسان‌سازی قابل مقایسه بودن گزارش‌ها را بسیار بالا می‌برد. اما این فرض دو پاشنه‌ی آشیل هم دارد که منتقدان همیشه به آن حمله می‌کنند.</w:t>
       </w:r>
     </w:p>
     <w:p>
@@ -13265,7 +13265,7 @@
           <w:szCs w:val="22"/>
           <w:rtl/>
         </w:rPr>
-        <w:t xml:space="preserve">دوم، تله‌ی تورم. حسابداری سنتی فرض می‌کند قدرت خرید پول در طول زمان ثابت است، یعنی یک میلیون تومانِ سال ۱۳۸۰ با یک میلیون تومانِ سال ۱۴۰۵ برابر است. در اقتصاد تورمی، مانند ایران، این فرض سخت زیر فشار می‌رود. زمینی که ۲۰ سال پیش خریده‌ایم با همان بهای تاریخی در ترازنامه می‌ماند و در کنار دارایی‌های تازه جمع می‌شود، گویی همه‌ی ریال‌ها هم‌ارزش‌اند؛ و این اطلاعاتی گمراه‌کننده می‌سازد. راه‌حل‌هایی مانند حسابداری تورمی پیشنهاد شده است، اما در حسابداری رایج که بر بهای تاریخی استوار است هنوز فرض بر این است که تورم نیست یا ناچیز است. ریشه‌ی این موضوع را در بخش نگهداشت سرمایه (بخش ۱-۱۳) دقیق‌تر خواهید دید.</w:t>
+        <w:t xml:space="preserve">دوم، تله‌ی تورم. حسابداری سنتی فرض می‌کند قدرت خرید پول در طول زمان ثابت است، یعنی یک میلیون تومانِ بیست‌وپنج سال پیش با یک میلیون تومانِ امروز برابر است. در اقتصاد تورمی، مانند ایران، این فرض سخت زیر فشار می‌رود. زمینی که ۲۰ سال پیش خریده‌ایم با همان بهای تاریخی در ترازنامه می‌ماند و در کنار دارایی‌های تازه جمع می‌شود، گویی همه‌ی ریال‌ها هم‌ارزش‌اند؛ و این اطلاعاتی گمراه‌کننده می‌سازد. راه‌حل‌هایی مانند حسابداری تورمی پیشنهاد شده است، اما در حسابداری رایج که بر بهای تاریخی استوار است هنوز فرض بر این است که تورم نیست یا ناچیز است. ریشه‌ی این موضوع را در بخش نگهداشت سرمایه (بخش ۱-۱۳) دقیق‌تر خواهید دید.</w:t>
       </w:r>
     </w:p>
     <w:p>
@@ -17802,7 +17802,7 @@
           <w:szCs w:val="22"/>
           <w:rtl/>
         </w:rPr>
-        <w:t xml:space="preserve">حالا هم می‌دانیم هر قلم با چه مبلغی نشان داده می‌شود، اما هنوز بخش مهمی از زندگی صورت‌های مالی را ندیده‌ایم: خود سود و زیان، یعنی درآمد و هزینه، کِی و چگونه شناسایی می‌شوند. همین پرسش به ماجرای تراکتور ۲۸ اسفند بازمی‌گردد.</w:t>
+        <w:t xml:space="preserve">حالا هم می‌دانیم هر قلم با چه مبلغی نشان داده می‌شود، اما هنوز بخش مهمی از زندگی صورت‌های مالی را ندیده‌ایم: خود سود و زیان، یعنی درآمد و هزینه، کِی و چگونه شناسایی می‌شوند. همین پرسش به ماجرای محموله کفش ۲۸ اسفند بازمی‌گردد.</w:t>
       </w:r>
     </w:p>
     <w:p>
@@ -17887,7 +17887,7 @@
           <w:szCs w:val="22"/>
           <w:rtl/>
         </w:rPr>
-        <w:t xml:space="preserve">شناسایی درآمد حساس‌ترین بخش حسابداری است، چون زمان آن مستقیماً بر سود، عملکرد مالی و تصمیم‌های استفاده‌کنندگان اثر می‌گذارد. نکته‌ی اصلی این است که شناسایی درآمد به زمان دریافت وجه نقد ربطی ندارد و بر ایفای تعهد در برابر مشتری استوار است. چارچوب مفهومی هم می‌گوید درآمد وقتی شناسایی می‌شود که قلم با تعریف درآمد (افزایش دارایی‌ها یا کاهش بدهی‌ها که به افزایش حقوق مالکانه می‌انجامد، به‌جز آورده مالکان) سازگار باشد و اطلاعات مربوط و بیان صادقانه فراهم کند (چارچوب مفهومی، بندهای ۴.۶۸، ۵.۶ و ۵.۷). پس برای تراکتور ۲۸ اسفند، پرسش اصلی «پول آمده یا نه؟» نیست، بلکه این است که شرکت بهار تعهد خود را ایفا کرده است یا نه.</w:t>
+        <w:t xml:space="preserve">شناسایی درآمد حساس‌ترین بخش حسابداری است، چون زمان آن مستقیماً بر سود، عملکرد مالی و تصمیم‌های استفاده‌کنندگان اثر می‌گذارد. نکته‌ی اصلی این است که شناسایی درآمد به زمان دریافت وجه نقد ربطی ندارد و بر ایفای تعهد در برابر مشتری استوار است. چارچوب مفهومی هم می‌گوید درآمد وقتی شناسایی می‌شود که قلم با تعریف درآمد (افزایش دارایی‌ها یا کاهش بدهی‌ها که به افزایش حقوق مالکانه می‌انجامد، به‌جز آورده مالکان) سازگار باشد و اطلاعات مربوط و بیان صادقانه فراهم کند (چارچوب مفهومی، بندهای ۴.۶۸، ۵.۶ و ۵.۷). پس برای محموله کفش ۲۸ اسفند، پرسش اصلی «پول آمده یا نه؟» نیست، بلکه این است که شرکت بهار تعهد خود را ایفا کرده است یا نه.</w:t>
       </w:r>
     </w:p>
     <w:p>
@@ -18149,7 +18149,7 @@
                 <w:szCs w:val="21"/>
                 <w:rtl/>
               </w:rPr>
-              <w:t xml:space="preserve">مثال: فروش تراکتور همراه با خدمات</w:t>
+              <w:t xml:space="preserve">مثال: فروش کفش ایمنی همراه با خدمات</w:t>
             </w:r>
           </w:p>
           <w:p>
@@ -18165,7 +18165,7 @@
                 <w:szCs w:val="20"/>
                 <w:rtl/>
               </w:rPr>
-              <w:t xml:space="preserve">شرکت بهار یک تراکتور و خدمات نگهداری یک‌ساله آن را با هم به مبلغ ۹۰۰ میلیون ریال می‌فروشد. اگر تراکتور به‌تنهایی ۸۵۰ میلیون و خدمات نگهداری به‌تنهایی ۱۵۰ میلیون ریال فروخته می‌شد (جمع ۱۰۰۰ میلیون)، تخصیص چنین است: تراکتور = ۹۰۰ × (۸۵۰ ÷ ۱۰۰۰) = </w:t>
+              <w:t xml:space="preserve">شرکت بهار ۱۰۰۰ جفت کفش ایمنی و خدمات تعویض و تعمیر یک‌ساله آنها را برای کارکنان یک کارخانه با هم به مبلغ ۹۰۰ میلیون ریال می‌فروشد. اگر کفش‌ها به‌تنهایی ۸۵۰ میلیون و خدمات تعویض و تعمیر به‌تنهایی ۱۵۰ میلیون ریال فروخته می‌شد (جمع ۱۰۰۰ میلیون)، تخصیص چنین است: کفش‌ها = ۹۰۰ × (۸۵۰ ÷ ۱۰۰۰) = </w:t>
             </w:r>
             <w:r>
               <w:rPr>
@@ -18205,7 +18205,7 @@
                 <w:szCs w:val="20"/>
                 <w:rtl/>
               </w:rPr>
-              <w:t xml:space="preserve">. درآمد تراکتور (۷۶۵) در </w:t>
+              <w:t xml:space="preserve">. درآمد کفش‌ها (۷۶۵) در </w:t>
             </w:r>
             <w:r>
               <w:rPr>
@@ -18271,7 +18271,7 @@
           <w:szCs w:val="22"/>
           <w:rtl/>
         </w:rPr>
-        <w:t xml:space="preserve">اکنون می‌توانیم به پرسش آغاز فصل پاسخ بدهیم. تراکتور ۲۸ اسفند تحویل شده و کنترل آن به مشتری رسیده است. پس تعهد عملکرد ایفا شده و درآمد ده‌میلیارد‌ریالی، آنچه حسابدار ارشد می‌گفت، متعلق به همین سال است و دریافت پول در فروردین فقط یک رویداد مالی بعدی است که یک مطالبه را به وجه نقد تبدیل می‌کند. همین منطق در خدمات هم صدق می‌کند: خشکشویی‌ای که لباس مشتری را در ۳۰ آبان شسته و آماده تحویل کرده، درآمد را در آبان می‌بیند، حتی اگر مشتری در هفته اول دی بیاید و پول بدهد. به شرط آنکه کنترل منتقل شده باشد؛ و اینکه کنترل چه زمانی منتقل می‌شود خود نیازمند قضاوت درباره ماهیت تعهد است.</w:t>
+        <w:t xml:space="preserve">اکنون می‌توانیم به پرسش آغاز فصل پاسخ بدهیم. محموله کفش ۲۸ اسفند تحویل شده و کنترل آن به مشتری رسیده است. پس تعهد عملکرد ایفا شده و درآمد ده‌میلیارد‌ریالی، آنچه حسابدار ارشد می‌گفت، متعلق به همین سال است و دریافت پول در فروردین فقط یک رویداد مالی بعدی است که یک مطالبه را به وجه نقد تبدیل می‌کند. همین منطق در خدمات هم صدق می‌کند: خشکشویی‌ای که لباس مشتری را در ۳۰ آبان شسته و آماده تحویل کرده، درآمد را در آبان می‌بیند، حتی اگر مشتری در هفته اول دی بیاید و پول بدهد. به شرط آنکه کنترل منتقل شده باشد؛ و اینکه کنترل چه زمانی منتقل می‌شود خود نیازمند قضاوت درباره ماهیت تعهد است.</w:t>
       </w:r>
     </w:p>
     <w:p>
@@ -18357,7 +18357,7 @@
           <w:szCs w:val="22"/>
           <w:rtl/>
         </w:rPr>
-        <w:t xml:space="preserve"> شامل مواد مستقیم، دستمزد مستقیم و سربار ساخت‌اند که مستقیماً به تولید کالا یا ارائه‌ی خدمتی معین مربوط‌اند. میان این هزینه‌ها و درآمد فروش محصول رابطه‌ی علت و معلولی مستقیم هست. بنابراین تا وقتی تراکتور نفروخته‌ایم، هزینه‌های ساخت آن به شکل دارایی، یعنی موجودی کالا، در صورت وضعیت مالی می‌ماند و وقتی تراکتور فروخته و درآمدش شناسایی شد، هزینه‌ها هم‌زمان به‌عنوان بهای تمام‌شده‌ی کالای فروش‌رفته شناسایی می‌شوند. این همان رابطه‌ای است که گاهی «تطابق هزینه‌ها با درآمدها» می‌نامند: هزینه در همان دوره‌ای شناسایی می‌شود که درآمد مرتبطش شناسایی شده است.</w:t>
+        <w:t xml:space="preserve"> شامل مواد مستقیم، دستمزد مستقیم و سربار ساخت‌اند که مستقیماً به تولید کالا یا ارائه‌ی خدمتی معین مربوط‌اند. میان این هزینه‌ها و درآمد فروش محصول رابطه‌ی علت و معلولی مستقیم هست. بنابراین تا وقتی کفش را نفروخته‌ایم، هزینه‌های ساخت آن به شکل دارایی، یعنی موجودی کالا، در صورت وضعیت مالی می‌ماند و وقتی کفش فروخته و درآمدش شناسایی شد، هزینه‌ها هم‌زمان به‌عنوان بهای تمام‌شده‌ی کالای فروش‌رفته شناسایی می‌شوند. این همان رابطه‌ای است که گاهی «تطابق هزینه‌ها با درآمدها» می‌نامند: هزینه در همان دوره‌ای شناسایی می‌شود که درآمد مرتبطش شناسایی شده است.</w:t>
       </w:r>
     </w:p>
     <w:tbl>
@@ -18471,7 +18471,58 @@
           <w:szCs w:val="22"/>
           <w:rtl/>
         </w:rPr>
-        <w:t xml:space="preserve"> مانند حقوق مدیران، هزینه‌های اداری، فروش و تبلیغات، ارتباط مستقیم و قابل اندازه‌گیری با محصول یا درآمدی مشخص ندارند و به یک بازه‌ی زمانی بسته‌اند؛ پس در صورت سود و زیان همان دوره می‌آیند. اما گاهی تطابق مستقیم ممکن نیست و دو راه جایگزین داریم. اگر دارایی در چند دوره به ایجاد منافع کمک می‌کند، بهای تمام‌شده‌ی آن به‌جای شناسایی یک‌باره، با روشی منظم و منطقی به دوره‌ها تخصیص می‌یابد؛ نمونه‌ی بارز آن استهلاک ساختمان، ماشین‌آلات و تجهیزات است. منطقی نیست بهای خرید ساختمان را یک‌جا در سال اول هزینه کنیم، بلکه آن را در طول عمر مفیدش، مثلاً ۲۰ سال، سرشکن می‌کنیم. و اگر نتوان رابطه‌ای منطقی یا قابل اتکا میان هزینه و درآمدهای آتی برقرار کرد، هزینه بی‌درنگ در دوره‌ی وقوع شناسایی می‌شود، حتی اگر انتظار رود منافع آن بعداً تحقق یابد. هزینه‌ی تبلیغات سال ۱۴۰۴ که آثارش در فروش ۱۴۰۵ پیدا می‌شود نمونه‌ی همین حالت است: پیوند آن با فروش آتی قابل اندازه‌گیری نیست و در سال ۱۴۰۴ هزینه می‌شود.</w:t>
+        <w:t xml:space="preserve"> مانند حقوق مدیران، هزینه‌های اداری، فروش و تبلیغات، ارتباط مستقیم و قابل اندازه‌گیری با محصول یا درآمدی مشخص ندارند و به یک بازه‌ی زمانی بسته‌اند؛ پس در صورت سود و زیان همان دوره می‌آیند. اما گاهی تطابق مستقیم ممکن نیست و دو راه جایگزین داریم. اگر دارایی در چند دوره به ایجاد منافع کمک می‌کند، بهای تمام‌شده‌ی آن به‌جای شناسایی یک‌باره، با روشی منظم و منطقی به دوره‌ها تخصیص می‌یابد؛ نمونه‌ی بارز آن استهلاک ساختمان، ماشین‌آلات و تجهیزات است. منطقی نیست بهای خرید ساختمان را یک‌جا در سال اول هزینه کنیم، بلکه آن را در طول عمر مفیدش، مثلاً ۲۰ سال، سرشکن می‌کنیم. و اگر نتوان رابطه‌ای منطقی یا قابل اتکا میان هزینه و درآمدهای آتی برقرار کرد، هزینه بی‌درنگ در دوره‌ی وقوع شناسایی می‌شود، حتی اگر انتظار رود منافع آن بعداً تحقق یابد. هزینه‌ی تبلیغات سال </w:t>
+      </w:r>
+      <w:r>
+        <w:rPr>
+          <w:rFonts w:ascii="Times New Roman" w:hAnsi="Times New Roman" w:eastAsia="Times New Roman" w:cs="B Zar"/>
+          <w:sz w:val="22"/>
+          <w:szCs w:val="22"/>
+        </w:rPr>
+        <w:t xml:space="preserve">×۱</w:t>
+      </w:r>
+      <w:r>
+        <w:rPr>
+          <w:rFonts w:ascii="Times New Roman" w:hAnsi="Times New Roman" w:eastAsia="Times New Roman" w:cs="B Zar"/>
+          <w:sz w:val="22"/>
+          <w:szCs w:val="22"/>
+          <w:rtl/>
+        </w:rPr>
+        <w:t xml:space="preserve"> که آثارش در فروش سال </w:t>
+      </w:r>
+      <w:r>
+        <w:rPr>
+          <w:rFonts w:ascii="Times New Roman" w:hAnsi="Times New Roman" w:eastAsia="Times New Roman" w:cs="B Zar"/>
+          <w:sz w:val="22"/>
+          <w:szCs w:val="22"/>
+        </w:rPr>
+        <w:t xml:space="preserve">×۲</w:t>
+      </w:r>
+      <w:r>
+        <w:rPr>
+          <w:rFonts w:ascii="Times New Roman" w:hAnsi="Times New Roman" w:eastAsia="Times New Roman" w:cs="B Zar"/>
+          <w:sz w:val="22"/>
+          <w:szCs w:val="22"/>
+          <w:rtl/>
+        </w:rPr>
+        <w:t xml:space="preserve"> پیدا می‌شود نمونه‌ی همین حالت است: پیوند آن با فروش آتی قابل اندازه‌گیری نیست و در سال </w:t>
+      </w:r>
+      <w:r>
+        <w:rPr>
+          <w:rFonts w:ascii="Times New Roman" w:hAnsi="Times New Roman" w:eastAsia="Times New Roman" w:cs="B Zar"/>
+          <w:sz w:val="22"/>
+          <w:szCs w:val="22"/>
+        </w:rPr>
+        <w:t xml:space="preserve">×۱</w:t>
+      </w:r>
+      <w:r>
+        <w:rPr>
+          <w:rFonts w:ascii="Times New Roman" w:hAnsi="Times New Roman" w:eastAsia="Times New Roman" w:cs="B Zar"/>
+          <w:sz w:val="22"/>
+          <w:szCs w:val="22"/>
+          <w:rtl/>
+        </w:rPr>
+        <w:t xml:space="preserve"> هزینه می‌شود.</w:t>
       </w:r>
     </w:p>
     <w:p>
@@ -20506,7 +20557,24 @@
           <w:szCs w:val="22"/>
           <w:rtl/>
         </w:rPr>
-        <w:t xml:space="preserve">تا اینجا اصول را دیدیم؛ وقت آن است که آن‌ها را در موقعیت‌های واقعی به کار ببندیم. شما مشاور مالی شرکت بهار هستید و پیش از بستن حساب‌ها (۲۹ اسفند ۱۴۰۵) شش تصمیم مدیریت را بررسی می‌کنید. هر مورد را خودتان تحلیل کنید و بعد پاسخ را بخوانید.</w:t>
+        <w:t xml:space="preserve">تا اینجا اصول را دیدیم؛ وقت آن است که آن‌ها را در موقعیت‌های واقعی به کار ببندیم. شما مشاور مالی شرکت بهار هستید و پیش از بستن حساب‌ها (۲۹ اسفند </w:t>
+      </w:r>
+      <w:r>
+        <w:rPr>
+          <w:rFonts w:ascii="Times New Roman" w:hAnsi="Times New Roman" w:eastAsia="Times New Roman" w:cs="B Zar"/>
+          <w:sz w:val="22"/>
+          <w:szCs w:val="22"/>
+        </w:rPr>
+        <w:t xml:space="preserve">×۱</w:t>
+      </w:r>
+      <w:r>
+        <w:rPr>
+          <w:rFonts w:ascii="Times New Roman" w:hAnsi="Times New Roman" w:eastAsia="Times New Roman" w:cs="B Zar"/>
+          <w:sz w:val="22"/>
+          <w:szCs w:val="22"/>
+          <w:rtl/>
+        </w:rPr>
+        <w:t xml:space="preserve">) شش تصمیم مدیریت را بررسی می‌کنید. هر مورد را خودتان تحلیل کنید و بعد پاسخ را بخوانید.</w:t>
       </w:r>
     </w:p>
     <w:p>
@@ -21100,7 +21168,7 @@
           <w:szCs w:val="22"/>
           <w:rtl/>
         </w:rPr>
-        <w:t xml:space="preserve">با پرسشی ساده شروع کردیم: وقتی دو حسابدار درباره‌ی یک تراکتور اختلاف دارند، چه کسی داور است؟ حالا می‌دانید پاسخ در یک هرم سه‌طبقه است که نمودار زیر آن را یک‌جا نشان می‌دهد. در ادامه همان مسیر را یک بار دیگر، این بار از بالا، مرور می‌کنیم.</w:t>
+        <w:t xml:space="preserve">با پرسشی ساده شروع کردیم: وقتی دو حسابدار درباره‌ی یک محموله کفش اختلاف دارند، چه کسی داور است؟ حالا می‌دانید پاسخ در یک هرم سه‌طبقه است که نمودار زیر آن را یک‌جا نشان می‌دهد. در ادامه همان مسیر را یک بار دیگر، این بار از بالا، مرور می‌کنیم.</w:t>
       </w:r>
     </w:p>
     <w:tbl>
@@ -33434,7 +33502,24 @@
           <w:szCs w:val="22"/>
           <w:rtl/>
         </w:rPr>
-        <w:t xml:space="preserve">۹. در پایان سال ۱۴۰۵ وضعیت‌های زیر درباره شرکت دماوند‌یخچال وجود دارد. هر مورد را به یکی از گروه‌های «دارایی»، «بدهی» یا «هیچ‌کدام» نسبت دهید و با استناد به بندهای چارچوب دلیل بیاورید:</w:t>
+        <w:t xml:space="preserve">۹. در پایان سال </w:t>
+      </w:r>
+      <w:r>
+        <w:rPr>
+          <w:rFonts w:ascii="Times New Roman" w:hAnsi="Times New Roman" w:eastAsia="Times New Roman" w:cs="B Zar"/>
+          <w:sz w:val="22"/>
+          <w:szCs w:val="22"/>
+        </w:rPr>
+        <w:t xml:space="preserve">×۱</w:t>
+      </w:r>
+      <w:r>
+        <w:rPr>
+          <w:rFonts w:ascii="Times New Roman" w:hAnsi="Times New Roman" w:eastAsia="Times New Roman" w:cs="B Zar"/>
+          <w:sz w:val="22"/>
+          <w:szCs w:val="22"/>
+          <w:rtl/>
+        </w:rPr>
+        <w:t xml:space="preserve"> وضعیت‌های زیر درباره شرکت دماوند‌یخچال وجود دارد. هر مورد را به یکی از گروه‌های «دارایی»، «بدهی» یا «هیچ‌کدام» نسبت دهید و با استناد به بندهای چارچوب دلیل بیاورید:</w:t>
       </w:r>
     </w:p>
     <w:p>
@@ -36338,7 +36423,41 @@
                 <w:szCs w:val="19"/>
                 <w:rtl/>
               </w:rPr>
-              <w:t xml:space="preserve">د) درست. ۹۰۰×۶۰۰/۱۰۰۰ = ۵۴۰ و ۹۰۰×۴۰۰/۱۰۰۰ = ۳۶۰.</w:t>
+              <w:t xml:space="preserve">د) درست. ۹۰۰</w:t>
+            </w:r>
+            <w:r>
+              <w:rPr>
+                <w:rFonts w:ascii="Times New Roman" w:hAnsi="Times New Roman" w:eastAsia="Times New Roman" w:cs="B Zar"/>
+                <w:sz w:val="19"/>
+                <w:szCs w:val="19"/>
+              </w:rPr>
+              <w:t xml:space="preserve">×۶۰۰/۱۰۰۰</w:t>
+            </w:r>
+            <w:r>
+              <w:rPr>
+                <w:rFonts w:ascii="Times New Roman" w:hAnsi="Times New Roman" w:eastAsia="Times New Roman" w:cs="B Zar"/>
+                <w:sz w:val="19"/>
+                <w:szCs w:val="19"/>
+                <w:rtl/>
+              </w:rPr>
+              <w:t xml:space="preserve"> = ۵۴۰ و ۹۰۰</w:t>
+            </w:r>
+            <w:r>
+              <w:rPr>
+                <w:rFonts w:ascii="Times New Roman" w:hAnsi="Times New Roman" w:eastAsia="Times New Roman" w:cs="B Zar"/>
+                <w:sz w:val="19"/>
+                <w:szCs w:val="19"/>
+              </w:rPr>
+              <w:t xml:space="preserve">×۴۰۰/۱۰۰۰</w:t>
+            </w:r>
+            <w:r>
+              <w:rPr>
+                <w:rFonts w:ascii="Times New Roman" w:hAnsi="Times New Roman" w:eastAsia="Times New Roman" w:cs="B Zar"/>
+                <w:sz w:val="19"/>
+                <w:szCs w:val="19"/>
+                <w:rtl/>
+              </w:rPr>
+              <w:t xml:space="preserve"> = ۳۶۰.</w:t>
             </w:r>
           </w:p>
         </w:tc>
@@ -42156,7 +42275,18 @@
                 <w:szCs w:val="21"/>
                 <w:rtl/>
               </w:rPr>
-              <w:t xml:space="preserve">مثال: شرکت بهار، تولیدکننده تراکتور و ماشین‌آلات کشاورزی، در ۲۹ اسفند ۱۴۰۵</w:t>
+              <w:t xml:space="preserve">مثال: شرکت بهار، تولیدکننده کفش، در ۲۹ اسفند </w:t>
+            </w:r>
+            <w:r>
+              <w:rPr>
+                <w:rFonts w:ascii="Times New Roman" w:hAnsi="Times New Roman" w:eastAsia="Times New Roman" w:cs="B Zar"/>
+                <w:b/>
+                <w:bCs/>
+                <w:color w:val="375623"/>
+                <w:sz w:val="21"/>
+                <w:szCs w:val="21"/>
+              </w:rPr>
+              <w:t xml:space="preserve">×۱</w:t>
             </w:r>
           </w:p>
           <w:p>
@@ -42172,7 +42302,24 @@
                 <w:szCs w:val="20"/>
                 <w:rtl/>
               </w:rPr>
-              <w:t xml:space="preserve">شرکت بهار، تولیدکننده تراکتور و ماشین‌آلات کشاورزی، حساب‌های سال ۱۴۰۵ را می‌بندد. مبالغ به میلیارد ریال است. رویدادهای زیر باید بررسی شوند:</w:t>
+              <w:t xml:space="preserve">شرکت بهار، تولیدکننده کفش، حساب‌های سال </w:t>
+            </w:r>
+            <w:r>
+              <w:rPr>
+                <w:rFonts w:ascii="Times New Roman" w:hAnsi="Times New Roman" w:eastAsia="Times New Roman" w:cs="B Zar"/>
+                <w:sz w:val="20"/>
+                <w:szCs w:val="20"/>
+              </w:rPr>
+              <w:t xml:space="preserve">×۱</w:t>
+            </w:r>
+            <w:r>
+              <w:rPr>
+                <w:rFonts w:ascii="Times New Roman" w:hAnsi="Times New Roman" w:eastAsia="Times New Roman" w:cs="B Zar"/>
+                <w:sz w:val="20"/>
+                <w:szCs w:val="20"/>
+                <w:rtl/>
+              </w:rPr>
+              <w:t xml:space="preserve"> را می‌بندد. مبالغ به میلیارد ریال است. رویدادهای زیر باید بررسی شوند:</w:t>
             </w:r>
           </w:p>
           <w:p>
@@ -42192,7 +42339,7 @@
                 <w:szCs w:val="20"/>
                 <w:rtl/>
               </w:rPr>
-              <w:t xml:space="preserve">الف) تحویل یک تراکتور به بهای ۱۰ به مشتری اعتباری در ۲۸ اسفند؛ مشتری قول پرداخت در ۱۵ فروردین را داده است.</w:t>
+              <w:t xml:space="preserve">الف) تحویل یک محموله کفش به بهای ۱۰ به مشتری اعتباری در ۲۸ اسفند؛ مشتری قول پرداخت در ۱۵ فروردین را داده است.</w:t>
             </w:r>
           </w:p>
           <w:p>
@@ -42212,7 +42359,7 @@
                 <w:szCs w:val="20"/>
                 <w:rtl/>
               </w:rPr>
-              <w:t xml:space="preserve">ب) دریافت ۴ پیش‌دریافت از مشتری برای تراکتورهایی که سال آینده تحویل می‌شود.</w:t>
+              <w:t xml:space="preserve">ب) دریافت ۴ پیش‌دریافت از مشتری برای کفش‌هایی که سال آینده تحویل می‌شود.</w:t>
             </w:r>
           </w:p>
           <w:p>
@@ -42400,7 +42547,7 @@
           <w:szCs w:val="22"/>
           <w:rtl/>
         </w:rPr>
-        <w:t xml:space="preserve"> شرکت تعهد فعلی به انتقال منبع اقتصادی (تحویل تراکتور) دارد که ناشی از رویداد گذشته (دریافت وجه) است (بندهای ۴.۲۷ و ۴.۴۳). شناسایی می‌شود؛ درآمد هنگام ایفای تعهد شناسایی خواهد شد.</w:t>
+        <w:t xml:space="preserve"> شرکت تعهد فعلی به انتقال منبع اقتصادی (تحویل کفش) دارد که ناشی از رویداد گذشته (دریافت وجه) است (بندهای ۴.۲۷ و ۴.۴۳). شناسایی می‌شود؛ درآمد هنگام ایفای تعهد شناسایی خواهد شد.</w:t>
       </w:r>
     </w:p>
     <w:p>
@@ -42552,7 +42699,7 @@
                 <w:szCs w:val="20"/>
                 <w:rtl/>
               </w:rPr>
-              <w:t xml:space="preserve">در پرسش آغازین، تراکتوری به بهای ۱۰ به مشتری اعتباری تحویل شده است. حسابدار جوان می‌گوید «تا پول نیامده، درآمدی نداریم». مطلوب است: (۱) پاسخ را بر پایه هدف گزارشگری، تعریف دارایی و درآمد و حسابداری تعهدی بنویسید؛ (۲) اگر مشتری ورشکسته شود، کدام ویژگی‌های کیفی و کدام مفهوم اندازه‌گیری مطرح می‌شود؟</w:t>
+              <w:t xml:space="preserve">در پرسش آغازین، محموله‌ای کفش به بهای ۱۰ به مشتری اعتباری تحویل شده است. حسابدار جوان می‌گوید «تا پول نیامده، درآمدی نداریم». مطلوب است: (۱) پاسخ را بر پایه هدف گزارشگری، تعریف دارایی و درآمد و حسابداری تعهدی بنویسید؛ (۲) اگر مشتری ورشکسته شود، کدام ویژگی‌های کیفی و کدام مفهوم اندازه‌گیری مطرح می‌شود؟</w:t>
             </w:r>
           </w:p>
         </w:tc>

</xml_diff>